<commit_message>
Restrict Q2 written answer and analysis to PPT Cable Sizing S78-S83 scope
</commit_message>
<xml_diff>
--- a/downloads/PIA5704/PIA5704_Q2_Answer_Analysis.docx
+++ b/downloads/PIA5704/PIA5704_Q2_Answer_Analysis.docx
@@ -7,9 +7,9 @@
         <w:pStyle w:val="Heading1"/>
       </w:pPr>
       <w:r>
-        <w:t>Q2 审题与答案分析</w:t>
+        <w:t>Q2 审题及PPT内容对应</w:t>
         <w:br/>
-        <w:t>Question interpretation and answer analysis</w:t>
+        <w:t>Question interpretation and PPT mapping</w:t>
       </w:r>
     </w:p>
     <w:p>
@@ -17,17 +17,61 @@
         <w:pStyle w:val="Heading2"/>
       </w:pPr>
       <w:r>
-        <w:t>1 题目实际要求 / What the question requires</w:t>
+        <w:t>1 审题 / Interpreting the task</w:t>
       </w:r>
     </w:p>
     <w:p>
       <w:r>
-        <w:t>题目核心是：“List and give qualitative explanations on the factors governing the selection and sizing of electric cables … of an industrial environment.” 即列出工业电气装置中影响电缆选择及截面确定的因素，并说明原因。题目前列出的三组表，是判断这些因素的依据。</w:t>
+        <w:t>题目要求列出工业电缆选型及截面的影响因素，并解释原因；无需逐项抄表或计算一个最终截面。</w:t>
       </w:r>
     </w:p>
     <w:p>
       <w:r>
-        <w:t>The task is to list the factors governing cable selection and sizing in an industrial installation and give qualitative explanations. The three specified table groups provide the basis for identifying and explaining those factors.</w:t>
+        <w:t>List factors affecting industrial cable selection and sizing and explain their effects qualitatively. Reproducing every table or calculating a final cable size is unnecessary.</w:t>
+      </w:r>
+    </w:p>
+    <w:p>
+      <w:pPr>
+        <w:pStyle w:val="Heading2"/>
+      </w:pPr>
+      <w:r>
+        <w:t>2 本版内容边界 / Scope of this revision</w:t>
+      </w:r>
+    </w:p>
+    <w:p>
+      <w:r>
+        <w:t>正文以《Electrical Distribution System II》S78–S83的Cable及Cable Sizing内容为限。题目指定的三份图表用于识别安装方式、查载流量、压降及修正系数，不把图表的每项细节扩展成新的答题主题。</w:t>
+      </w:r>
+    </w:p>
+    <w:p>
+      <w:r>
+        <w:t>The answer follows Cable and Cable Sizing in Electrical Distribution System II, S78–S83. The three supplied extracts support identification of installation methods, current and voltage-drop ratings, and correction factors; every table detail is not made into an additional answer topic.</w:t>
+      </w:r>
+    </w:p>
+    <w:p>
+      <w:pPr>
+        <w:pStyle w:val="Heading2"/>
+      </w:pPr>
+      <w:r>
+        <w:t>3 先区分选型和截面 / Selection versus sizing</w:t>
+      </w:r>
+    </w:p>
+    <w:p>
+      <w:r>
+        <w:t>S78说明结构选型；S79列载流量、压降、损耗三项截面标准；S80列外部影响、安装、负载、压降及能源效益。正文框架直接来自这些项目。</w:t>
+      </w:r>
+    </w:p>
+    <w:p>
+      <w:r>
+        <w:t>S78 covers construction; S79 gives capacity, voltage drop and power loss as sizing criteria; S80 lists external influences, installation, loading, voltage drop and efficiency. These establish the answer framework.</w:t>
+      </w:r>
+    </w:p>
+    <w:p>
+      <w:pPr>
+        <w:pStyle w:val="Heading2"/>
+      </w:pPr>
+      <w:r>
+        <w:t>正式答案第1–5项对应 / Mapping factors 1–5</w:t>
       </w:r>
     </w:p>
     <w:tbl>
@@ -84,9 +128,9 @@
               <w:rPr>
                 <w:sz w:val="20"/>
               </w:rPr>
-              <w:t>List</w:t>
+              <w:t>1 结构及材料</w:t>
               <w:br/>
-              <w:t>列出因素</w:t>
+              <w:t>Construction</w:t>
             </w:r>
           </w:p>
         </w:tc>
@@ -102,9 +146,9 @@
               <w:rPr>
                 <w:sz w:val="20"/>
               </w:rPr>
-              <w:t>将温度、成组、安装方式、负载及压降等分别写明。</w:t>
+              <w:t>S78、S80：铜／铝、芯数、PVC／XLPE、护套及铠装；解释为什么必须使用匹配电缆类型的额定资料。</w:t>
               <w:br/>
-              <w:t>Identify individual factors such as temperature, grouping, installation, loading and voltage drop.</w:t>
+              <w:t>S78/S80: material, cores, insulation, sheath and armour; use rating data matching the selected type.</w:t>
             </w:r>
           </w:p>
         </w:tc>
@@ -125,9 +169,9 @@
               <w:rPr>
                 <w:sz w:val="20"/>
               </w:rPr>
-              <w:t>Qualitative explanations</w:t>
+              <w:t>2 外部影响</w:t>
               <w:br/>
-              <w:t>定性解释</w:t>
+              <w:t>External influences</w:t>
             </w:r>
           </w:p>
         </w:tc>
@@ -143,9 +187,9 @@
               <w:rPr>
                 <w:sz w:val="20"/>
               </w:rPr>
-              <w:t>每项说明“条件 → 影响 → 选型结果”：例如成组增加 → 互相加热 → 载流量降低，可能需增大截面或改善间距。</w:t>
+              <w:t>S80：评估环境条件及一般特性，以指定适当设备。正文保持该层次，不另列课件未展开的专门要求。</w:t>
               <w:br/>
-              <w:t>Explain condition → effect → selection consequence; e.g. more grouping → mutual heating → lower capacity and possibly a larger size or better spacing.</w:t>
+              <w:t>S80: assess environmental conditions and general characteristics for suitable selection; retain that level of detail.</w:t>
             </w:r>
           </w:p>
         </w:tc>
@@ -166,9 +210,9 @@
               <w:rPr>
                 <w:sz w:val="20"/>
               </w:rPr>
-              <w:t>Selection and sizing</w:t>
+              <w:t>3 安装方式</w:t>
               <w:br/>
-              <w:t>选型与截面</w:t>
+              <w:t>Installation</w:t>
             </w:r>
           </w:p>
         </w:tc>
@@ -184,9 +228,9 @@
               <w:rPr>
                 <w:sz w:val="20"/>
               </w:rPr>
-              <w:t>选型包括导体、绝缘、芯数、护套和铠装；截面要满足热、电压及损耗要求。两方面都需回答。</w:t>
+              <w:t>S80–S81：先选电缆类型及安装方式，再查载流量；Appendix 7辅助确定参考Method。</w:t>
               <w:br/>
-              <w:t>Selection includes material, insulation, cores, sheath and armour. Sizing must satisfy thermal, voltage and loss requirements. Address both.</w:t>
+              <w:t>S80–S81: select type and installation before rating; Appendix 7 identifies the reference Method.</w:t>
             </w:r>
           </w:p>
         </w:tc>
@@ -207,9 +251,9 @@
               <w:rPr>
                 <w:sz w:val="20"/>
               </w:rPr>
-              <w:t>Industrial environment</w:t>
+              <w:t>4 负载</w:t>
               <w:br/>
-              <w:t>工业背景</w:t>
+              <w:t>Loading</w:t>
             </w:r>
           </w:p>
         </w:tc>
@@ -225,9 +269,50 @@
               <w:rPr>
                 <w:sz w:val="20"/>
               </w:rPr>
-              <w:t>结合电动机、长时间负载、多回路桥架、油污、化学品、振动和机械损伤解释，而不只写住宅回路的通用词语。</w:t>
+              <w:t>S80–S81：Loading及Ib决定电流需求。解释电流增加与导体温升、截面之间的关系。</w:t>
               <w:br/>
-              <w:t>Connect the factors to motors, long operating hours, grouped circuits, oil, chemicals, vibration and mechanical damage.</w:t>
+              <w:t>S80–S81: loading and Ib establish demand; explain the relation to heating and size.</w:t>
+            </w:r>
+          </w:p>
+        </w:tc>
+      </w:tr>
+      <w:tr>
+        <w:trPr>
+          <w:cantSplit/>
+        </w:trPr>
+        <w:tc>
+          <w:tcPr>
+            <w:tcW w:type="dxa" w:w="2608"/>
+          </w:tcPr>
+          <w:p>
+            <w:pPr>
+              <w:spacing w:before="40" w:after="80" w:line="250" w:lineRule="auto"/>
+            </w:pPr>
+            <w:r>
+              <w:rPr>
+                <w:sz w:val="20"/>
+              </w:rPr>
+              <w:t>5 温度</w:t>
+              <w:br/>
+              <w:t>Temperature</w:t>
+            </w:r>
+          </w:p>
+        </w:tc>
+        <w:tc>
+          <w:tcPr>
+            <w:tcW w:type="dxa" w:w="7540"/>
+          </w:tcPr>
+          <w:p>
+            <w:pPr>
+              <w:spacing w:before="40" w:after="80" w:line="250" w:lineRule="auto"/>
+            </w:pPr>
+            <w:r>
+              <w:rPr>
+                <w:sz w:val="20"/>
+              </w:rPr>
+              <w:t>S81：Ca；S83示例以45°C及Ca＝0.79说明修正后的选线要求。</w:t>
+              <w:br/>
+              <w:t>S81: Ca; S83 illustrates it with 45°C and Ca = 0.79.</w:t>
             </w:r>
           </w:p>
         </w:tc>
@@ -235,41 +320,13 @@
     </w:tbl>
     <w:p>
       <w:pPr>
-        <w:pStyle w:val="Heading2"/>
-      </w:pPr>
-      <w:r>
-        <w:t>2 答案范围 / Scope of the answer</w:t>
-      </w:r>
-    </w:p>
-    <w:p>
-      <w:r>
-        <w:t>Q2没有给定负载、电压、线路长度或完整敷设条件，因此不能得出唯一mm²答案，也无需抄录所有Method或修正数值。正式答案采用12项因素，每项包含原因和选型影响；本分析稿保留查表细节。Q1中的“major components”并不是Q2的限制。</w:t>
-      </w:r>
-    </w:p>
-    <w:p>
-      <w:r>
-        <w:t>Q2 supplies no load, voltage, route length or complete installation conditions, so no unique conductor size can be calculated. There is no need to reproduce every Method or factor. The written answer gives 12 factors with causes and consequences; this guide retains the table details. The phrase “major components” belongs to Q1, not Q2.</w:t>
-      </w:r>
-    </w:p>
-    <w:p>
-      <w:r>
-        <w:t>PPT《Electrical Distribution System II》的Cable Sizing部分，S78–S83分别覆盖电缆结构、载流量、压降、损耗、外部环境及选线示例。正式答案以这些内容为框架，再补全所给图表的条件。</w:t>
-      </w:r>
-    </w:p>
-    <w:p>
-      <w:r>
-        <w:t>In Electrical Distribution System II, Cable Sizing slides S78–S83 cover construction, capacity, voltage drop, losses, external influences and a worked example. These provide the framework, supplemented by the supplied tables.</w:t>
-      </w:r>
-    </w:p>
-    <w:p>
-      <w:pPr>
         <w:pStyle w:val="Heading1"/>
         <w:pageBreakBefore/>
       </w:pPr>
       <w:r>
-        <w:t>3 三组图表怎样配合</w:t>
+        <w:t>4 其余因素及三组图表的作用</w:t>
         <w:br/>
-        <w:t>Using the three table groups together</w:t>
+        <w:t>Remaining factors and the three table groups</w:t>
       </w:r>
     </w:p>
     <w:tbl>
@@ -326,9 +383,7 @@
               <w:rPr>
                 <w:sz w:val="20"/>
               </w:rPr>
-              <w:t>① Appendix 7</w:t>
-              <w:br/>
-              <w:t>识别安装条件</w:t>
+              <w:t>6 成组 / Grouping</w:t>
             </w:r>
           </w:p>
         </w:tc>
@@ -344,9 +399,9 @@
               <w:rPr>
                 <w:sz w:val="20"/>
               </w:rPr>
-              <w:t>先看电缆在哪里、怎样固定、是否围护、是否隔热、支承及间距如何，然后确定参考Method。</w:t>
+              <w:t>S81明确指出围护或成束回路的Cg可使截面显著增加，并给出It ≥ In/Cg。答案解释其原因是互相加热。</w:t>
               <w:br/>
-              <w:t>Identify location, support, enclosure, insulation and spacing, then determine the reference Method.</w:t>
+              <w:t>S81 states that Cg for enclosed/bunched circuits may significantly increase size and gives It ≥ In/Cg; the explanation is mutual heating.</w:t>
             </w:r>
           </w:p>
         </w:tc>
@@ -367,9 +422,7 @@
               <w:rPr>
                 <w:sz w:val="20"/>
               </w:rPr>
-              <w:t>② Table A6(1)</w:t>
-              <w:br/>
-              <w:t>读取基准数据</w:t>
+              <w:t>7 隔热 / Insulation</w:t>
             </w:r>
           </w:p>
         </w:tc>
@@ -385,9 +438,9 @@
               <w:rPr>
                 <w:sz w:val="20"/>
               </w:rPr>
-              <w:t>匹配电缆类型、截面、相制及Method栏位，读取基准载流量；压降页另按相制及排列选值。</w:t>
+              <w:t>S81列Ci。答案只解释隔热阻碍散热及影响额定值，不扩展成完整隔热设计计算。</w:t>
               <w:br/>
-              <w:t>Match cable type, cross-section, phase and Method to the base current rating; select voltage-drop data by phase and formation.</w:t>
+              <w:t>S81 lists Ci; explain restricted cooling and the rating effect without adding a full insulation-design exercise.</w:t>
             </w:r>
           </w:p>
         </w:tc>
@@ -408,9 +461,9 @@
               <w:rPr>
                 <w:sz w:val="20"/>
               </w:rPr>
-              <w:t>③ Tables A5(1)–A5(6)</w:t>
+              <w:t>8 保护器件</w:t>
               <w:br/>
-              <w:t>修正与适用条件</w:t>
+              <w:t>Protective device</w:t>
             </w:r>
           </w:p>
         </w:tc>
@@ -426,9 +479,91 @@
               <w:rPr>
                 <w:sz w:val="20"/>
               </w:rPr>
-              <w:t>根据实际温度、成组、隔热、保护器件及地沟条件修正，再检查压降、故障保护及损耗。不属于该布置的系数不能任意相乘。</w:t>
+              <w:t>S81列In及Cd，半封闭熔断器Cd＝0.725，并给出It的修正关系。</w:t>
               <w:br/>
-              <w:t>Apply relevant temperature, grouping, insulation, device and trench corrections, then check voltage drop, protection and losses. Do not multiply unrelated factors.</w:t>
+              <w:t>S81 lists In and Cd, gives Cd = 0.725 for semi-enclosed fuses, and relates them to required It.</w:t>
+            </w:r>
+          </w:p>
+        </w:tc>
+      </w:tr>
+      <w:tr>
+        <w:trPr>
+          <w:cantSplit/>
+        </w:trPr>
+        <w:tc>
+          <w:tcPr>
+            <w:tcW w:type="dxa" w:w="2608"/>
+          </w:tcPr>
+          <w:p>
+            <w:pPr>
+              <w:spacing w:before="40" w:after="80" w:line="250" w:lineRule="auto"/>
+            </w:pPr>
+            <w:r>
+              <w:rPr>
+                <w:sz w:val="20"/>
+              </w:rPr>
+              <w:t>9 长度及压降</w:t>
+              <w:br/>
+              <w:t>Length and voltage drop</w:t>
+            </w:r>
+          </w:p>
+        </w:tc>
+        <w:tc>
+          <w:tcPr>
+            <w:tcW w:type="dxa" w:w="7540"/>
+          </w:tcPr>
+          <w:p>
+            <w:pPr>
+              <w:spacing w:before="40" w:after="80" w:line="250" w:lineRule="auto"/>
+            </w:pPr>
+            <w:r>
+              <w:rPr>
+                <w:sz w:val="20"/>
+              </w:rPr>
+              <w:t>S81列长度；S82给压降资料及公式；S83把上游压降纳入示例。</w:t>
+              <w:br/>
+              <w:t>S81 lists length; S82 supplies voltage-drop inputs and equation; S83 allows for upstream drop.</w:t>
+            </w:r>
+          </w:p>
+        </w:tc>
+      </w:tr>
+      <w:tr>
+        <w:trPr>
+          <w:cantSplit/>
+        </w:trPr>
+        <w:tc>
+          <w:tcPr>
+            <w:tcW w:type="dxa" w:w="2608"/>
+          </w:tcPr>
+          <w:p>
+            <w:pPr>
+              <w:spacing w:before="40" w:after="80" w:line="250" w:lineRule="auto"/>
+            </w:pPr>
+            <w:r>
+              <w:rPr>
+                <w:sz w:val="20"/>
+              </w:rPr>
+              <w:t>10 损耗及能源效益</w:t>
+              <w:br/>
+              <w:t>Loss and efficiency</w:t>
+            </w:r>
+          </w:p>
+        </w:tc>
+        <w:tc>
+          <w:tcPr>
+            <w:tcW w:type="dxa" w:w="7540"/>
+          </w:tcPr>
+          <w:p>
+            <w:pPr>
+              <w:spacing w:before="40" w:after="80" w:line="250" w:lineRule="auto"/>
+            </w:pPr>
+            <w:r>
+              <w:rPr>
+                <w:sz w:val="20"/>
+              </w:rPr>
+              <w:t>S79列Power loss，S80列Energy efficiency。电阻及截面之间的解释用于说明该因素为何影响选线。</w:t>
+              <w:br/>
+              <w:t>S79 lists power loss and S80 energy efficiency; relate resistance and cross-section to the selection consequence.</w:t>
             </w:r>
           </w:p>
         </w:tc>
@@ -439,92 +574,7 @@
         <w:pStyle w:val="Heading2"/>
       </w:pPr>
       <w:r>
-        <w:t>A6(1)的适用范围 / Scope of A6(1)</w:t>
-      </w:r>
-    </w:p>
-    <w:p>
-      <w:r>
-        <w:t>表头为单芯、PVC绝缘、非铠装铜导体电缆，可带或不带护套；基准环境温度30°C、导体温度70°C。其他材料或结构须找适用额定资料。表注仅允许指定BS 6004柔性电缆及BS 6231的85／90°C耐热PVC电缆在固定安装时使用第2–5栏载流量，不能推广到所有栏位。</w:t>
-      </w:r>
-    </w:p>
-    <w:p>
-      <w:r>
-        <w:t>The table covers single-core, PVC-insulated, non-armoured copper cables, with or without sheath, at 30°C ambient and 70°C conductor temperature. Other constructions need applicable data. Its note extends columns 2–5 only to the specified BS 6004 flexible and BS 6231 85/90°C heat-resisting PVC cables in fixed installations.</w:t>
-      </w:r>
-    </w:p>
-    <w:p>
-      <w:pPr>
-        <w:pStyle w:val="Heading2"/>
-      </w:pPr>
-      <w:r>
-        <w:t>为什么必须选对Method / Why the Method matters</w:t>
-      </w:r>
-    </w:p>
-    <w:p>
-      <w:r>
-        <w:t>同为4mm²三相铜电缆，A6(1)的基准值为Method 4：24A；Method 3：28A；Method 1：33A。隔热墙内、一般管槽内、直接固定的散热能力不同，因此同一截面没有唯一载流量。这三个值只是解释安装方式影响的比较，不是Q2的最终选线结果。</w:t>
-      </w:r>
-    </w:p>
-    <w:p>
-      <w:r>
-        <w:t>For the same 4mm² three-phase cable, A6(1) gives 24A for Method 4, 28A for Method 3 and 33A for Method 1. An insulated wall, ordinary conduit/trunking and clipped-direct installation dissipate heat differently. These values illustrate the installation effect; they do not specify a final cable for Q2.</w:t>
-      </w:r>
-    </w:p>
-    <w:p>
-      <w:r>
-        <w:t>Appendix 7中，安装方式3、5及7–10归入参考Method 3；4、6及15归入参考Method 4。方式11为有孔桥架；12、13分别覆盖所示单芯及多芯自由空气布置；14和17按适当的12或13处理。18–20为封闭地沟。方式16的建筑孔洞则须按其尺寸表注判断。安装方式编号与参考Method并非总是相同。</w:t>
-      </w:r>
-    </w:p>
-    <w:p>
-      <w:r>
-        <w:t>Installation items 3, 5 and 7–10 use reference Method 3; items 4, 6 and 15 use Method 4. Item 11 covers perforated trays; 12 and 13 cover the stated single-core and multicore free-air arrangements. Items 14 and 17 use 12 or 13 as appropriate; 18–20 are enclosed trenches. Item 16 requires its void-dimension rules. Installation-item and reference-Method numbers are not always identical.</w:t>
-      </w:r>
-    </w:p>
-    <w:p>
-      <w:pPr>
-        <w:pStyle w:val="Heading1"/>
-        <w:pageBreakBefore/>
-      </w:pPr>
-      <w:r>
-        <w:t>4 温度与成组修正的判读</w:t>
-        <w:br/>
-        <w:t>Interpreting temperature and grouping corrections</w:t>
-      </w:r>
-    </w:p>
-    <w:p>
-      <w:pPr>
-        <w:pStyle w:val="Heading2"/>
-      </w:pPr>
-      <w:r>
-        <w:t>A5(1)与A5(2)：先区分保护用途 / Establish the protection duty</w:t>
-      </w:r>
-    </w:p>
-    <w:p>
-      <w:r>
-        <w:t>温度升高会减少允许温升余量。A5(1)用于仅作短路保护的情况，也用于一般过载保护，但BS 3036半封闭熔断器承担过载保护时改用A5(2)。普通70°C PVC在45°C下，前者为0.79、后者为0.91。两数不能任选，也不能同时相乘。</w:t>
-      </w:r>
-    </w:p>
-    <w:p>
-      <w:r>
-        <w:t>Higher ambient temperature reduces thermal margin. A5(1) applies to short-circuit-only protection and generally to overload protection, except BS 3036 semi-enclosed fuses providing overload protection, which use A5(2). At 45°C, ordinary 70°C PVC has factors 0.79 and 0.91 respectively. These are alternatives, not simultaneous multipliers.</w:t>
-      </w:r>
-    </w:p>
-    <w:p>
-      <w:pPr>
-        <w:pStyle w:val="Heading2"/>
-      </w:pPr>
-      <w:r>
-        <w:t>A5(3)：数量及排列决定互热 / Count and arrangement determine mutual heating</w:t>
-      </w:r>
-    </w:p>
-    <w:p>
-      <w:r>
-        <w:t>围护或成束那一行，2回路系数0.80、4回路0.65。若其他条件相同，系数越低，单位截面可用载流量越小，可能需要更大截面。其他桥架排列须查各自的行，不能一律使用成束系数。</w:t>
-      </w:r>
-    </w:p>
-    <w:p>
-      <w:r>
-        <w:t>In the enclosed/bunched row, the factors are 0.80 for two circuits and 0.65 for four. With other conditions unchanged, a lower factor means less available capacity and possibly a larger conductor. Other tray arrangements require their own rows, rather than the bunched factor in every case.</w:t>
+        <w:t>三组表各解决什么问题 / What each table group determines</w:t>
       </w:r>
     </w:p>
     <w:tbl>
@@ -581,7 +631,7 @@
               <w:rPr>
                 <w:sz w:val="20"/>
               </w:rPr>
-              <w:t>间距 / Spacing</w:t>
+              <w:t>Appendix 7</w:t>
             </w:r>
           </w:p>
         </w:tc>
@@ -597,9 +647,9 @@
               <w:rPr>
                 <w:sz w:val="20"/>
               </w:rPr>
-              <w:t>“Spaced”指相邻电缆表面净距至少一个外径De。表注所适用的水平排列中，净距大于2De可免成组修正；不能将此规则推广至所有围护及地沟。</w:t>
+              <w:t>确定实际安装条件对应的参考Method，再选A6(1)栏位。不同安装方式的散热不同。</w:t>
               <w:br/>
-              <w:t>“Spaced” means a surface clearance of at least De. The note removes grouping correction above 2De in its applicable horizontal arrangements, not in every enclosure or trench.</w:t>
+              <w:t>Identify the reference Method for the actual installation, then select the A6(1) column; installation changes cooling.</w:t>
             </w:r>
           </w:p>
         </w:tc>
@@ -620,7 +670,7 @@
               <w:rPr>
                 <w:sz w:val="20"/>
               </w:rPr>
-              <w:t>相同截面 / Same size</w:t>
+              <w:t>Table A6(1)</w:t>
             </w:r>
           </w:p>
         </w:tc>
@@ -636,9 +686,9 @@
               <w:rPr>
                 <w:sz w:val="20"/>
               </w:rPr>
-              <w:t>基本系数适用于同一截面的成组电缆；混合截面需要适用评估。</w:t>
+              <w:t>按电缆类型、截面、参考Method及相制选载流量；压降页另按相制及排列选值。表头为单芯、PVC绝缘、非铠装铜电缆，参考环境30°C、导体70°C。</w:t>
               <w:br/>
-              <w:t>The basic factors apply to groups of one conductor size; mixed sizes need an applicable assessment.</w:t>
+              <w:t>Select current ratings by type, size, Method and phase; use the corresponding voltage-drop data. The main table covers single-core, PVC-insulated, non-armoured copper cable at 30°C ambient/70°C conductor temperature.</w:t>
             </w:r>
           </w:p>
         </w:tc>
@@ -659,7 +709,7 @@
               <w:rPr>
                 <w:sz w:val="20"/>
               </w:rPr>
-              <w:t>不同温度 / Mixed temperatures</w:t>
+              <w:t>Correction tables</w:t>
             </w:r>
           </w:p>
         </w:tc>
@@ -675,48 +725,9 @@
               <w:rPr>
                 <w:sz w:val="20"/>
               </w:rPr>
-              <w:t>同组电缆的允许导体温度不同时，按组内最低允许温度确定额定值。</w:t>
+              <w:t>为S81中的Ca、Cg、Ci、Cd提供适用资料。A5(1)／A5(2)区分温度修正的保护条件；A5(3)、A5(4)、A5(5)分别对应成组、隔热及器件类型。各表只在适用时采用。</w:t>
               <w:br/>
-              <w:t>For mixed permissible conductor temperatures, base the rating on the lowest.</w:t>
-            </w:r>
-          </w:p>
-        </w:tc>
-      </w:tr>
-      <w:tr>
-        <w:trPr>
-          <w:cantSplit/>
-        </w:trPr>
-        <w:tc>
-          <w:tcPr>
-            <w:tcW w:type="dxa" w:w="2608"/>
-          </w:tcPr>
-          <w:p>
-            <w:pPr>
-              <w:spacing w:before="40" w:after="80" w:line="250" w:lineRule="auto"/>
-            </w:pPr>
-            <w:r>
-              <w:rPr>
-                <w:sz w:val="20"/>
-              </w:rPr>
-              <w:t>30%表注 / The 30% note</w:t>
-            </w:r>
-          </w:p>
-        </w:tc>
-        <w:tc>
-          <w:tcPr>
-            <w:tcW w:type="dxa" w:w="7540"/>
-          </w:tcPr>
-          <w:p>
-            <w:pPr>
-              <w:spacing w:before="40" w:after="80" w:line="250" w:lineRule="auto"/>
-            </w:pPr>
-            <w:r>
-              <w:rPr>
-                <w:sz w:val="20"/>
-              </w:rPr>
-              <w:t>已知运行条件下，某电缆预计电流不超过其成组额定值30%时，可在计算其余电缆的成组系数时忽略它；其自身仍须满足选线及保护要求。</w:t>
-              <w:br/>
-              <w:t>A cable expected under known conditions to carry no more than 30% of its grouped rating may be ignored when rating the remaining cables; its own sizing and protection remain necessary.</w:t>
+              <w:t>Provide applicable Ca, Cg, Ci and Cd data. A5(1)/A5(2) distinguish protection conditions for temperature correction; A5(3), A5(4) and A5(5) cover grouping, insulation and device type. Apply each only where relevant.</w:t>
             </w:r>
           </w:p>
         </w:tc>
@@ -728,9 +739,9 @@
         <w:pageBreakBefore/>
       </w:pPr>
       <w:r>
-        <w:t>5 隔热、器件及地沟修正</w:t>
+        <w:t>5 PPT载流量关系及示例判读</w:t>
         <w:br/>
-        <w:t>Insulation, device and trench corrections</w:t>
+        <w:t>PPT current-rating relation and example</w:t>
       </w:r>
     </w:p>
     <w:p>
@@ -738,111 +749,7 @@
         <w:pStyle w:val="Heading2"/>
       </w:pPr>
       <w:r>
-        <w:t>A5(4)：隔热影响不能重复计算 / Avoid duplicating insulation effects</w:t>
-      </w:r>
-    </w:p>
-    <w:p>
-      <w:r>
-        <w:t>隔热墙或天花内且一侧接触导热表面的所示布置，应采用Method 4的基准值。单根电缆完全被隔热材料包围超过0.5m时，如无更精确资料，按Method 1开放直接固定载流量的0.5倍取值。短包围长度50、100、200、400mm的系数为0.88、0.78、0.63、0.51；限导体不大于10mm²且隔热材料导热系数大于0.04W/(m·K)。不能将这些数任意再乘到已经代表同一隔热条件的额定值上。</w:t>
-      </w:r>
-    </w:p>
-    <w:p>
-      <w:r>
-        <w:t>Use Method 4 for the specified insulated-wall/ceiling arrangement with one side in conducting contact. For a single cable totally surrounded for more than 0.5m, absent more precise data, use 0.5 times its Method 1 clipped-direct capacity. Factors for 50, 100, 200 and 400mm are 0.88, 0.78, 0.63 and 0.51, limited to conductors up to 10mm² and insulation conductivity above 0.04W/(m·K). Do not duplicate an insulation effect already included in the base rating.</w:t>
-      </w:r>
-    </w:p>
-    <w:p>
-      <w:pPr>
-        <w:pStyle w:val="Heading2"/>
-      </w:pPr>
-      <w:r>
-        <w:t>A5(5)：器件因素与环境因素分开 / Distinguish the device factor</w:t>
-      </w:r>
-    </w:p>
-    <w:p>
-      <w:r>
-        <w:t>PPT以Cd表示器件修正：BS 3036半封闭熔断器为0.725，其他所列器件为1.0。它用于保护配合，不是环境温度系数；因此采用A5(2)后，仍应按适用条件考虑A5(5)。</w:t>
-      </w:r>
-    </w:p>
-    <w:p>
-      <w:r>
-        <w:t>The PPT denotes the device factor by Cd: 0.725 for BS 3036 semi-enclosed fuses and 1.0 for the other listed devices. This concerns protection coordination, not ambient temperature. A5(5) must therefore still be considered, where applicable, after selecting A5(2).</w:t>
-      </w:r>
-    </w:p>
-    <w:p>
-      <w:pPr>
-        <w:pStyle w:val="Heading2"/>
-      </w:pPr>
-      <w:r>
-        <w:t>A5(6)：封闭地沟采用专用修正 / Use the trench-specific correction</w:t>
-      </w:r>
-    </w:p>
-    <w:p>
-      <w:r>
-        <w:t>适用于Appendix 7的18–20，将表中系数用于相应Method 12或13的基础载流量。必须匹配沟体、盖板、尺寸、间距、数量及截面。截面改变后重新选系数；不同允许温度混组按最低温度。不要针对同一互热效应重复叠加一般成组系数。</w:t>
-      </w:r>
-    </w:p>
-    <w:p>
-      <w:r>
-        <w:t>For items 18–20, apply the factor to the appropriate Method 12 or 13 base capacity. Match trench construction, cover, dimensions, spacing, count and conductor size. Recheck the factor after changing size, and use the lowest permissible temperature for mixed groups. Avoid duplicating the same mutual-heating effect with another grouping factor.</w:t>
-      </w:r>
-    </w:p>
-    <w:p>
-      <w:pPr>
-        <w:pStyle w:val="Heading2"/>
-      </w:pPr>
-      <w:r>
-        <w:t>PPT选线关系的含义 / Meaning of the PPT sizing relations</w:t>
-      </w:r>
-    </w:p>
-    <w:p>
-      <w:pPr>
-        <w:jc w:val="center"/>
-      </w:pPr>
-      <w:r>
-        <w:rPr>
-          <w:b/>
-          <w:sz w:val="24"/>
-        </w:rPr>
-        <w:t>I</w:t>
-      </w:r>
-      <w:r>
-        <w:rPr>
-          <w:b/>
-          <w:sz w:val="24"/>
-          <w:vertAlign w:val="subscript"/>
-        </w:rPr>
-        <w:t>b</w:t>
-      </w:r>
-      <w:r>
-        <w:rPr>
-          <w:b/>
-          <w:sz w:val="24"/>
-        </w:rPr>
-        <w:t xml:space="preserve"> ≤ I</w:t>
-      </w:r>
-      <w:r>
-        <w:rPr>
-          <w:b/>
-          <w:sz w:val="24"/>
-          <w:vertAlign w:val="subscript"/>
-        </w:rPr>
-        <w:t>n</w:t>
-      </w:r>
-      <w:r>
-        <w:rPr>
-          <w:b/>
-          <w:sz w:val="24"/>
-        </w:rPr>
-        <w:t xml:space="preserve"> ≤ I</w:t>
-      </w:r>
-      <w:r>
-        <w:rPr>
-          <w:b/>
-          <w:sz w:val="24"/>
-          <w:vertAlign w:val="subscript"/>
-        </w:rPr>
-        <w:t>z</w:t>
+        <w:t>S81：修正关系 / Correction relation</w:t>
       </w:r>
     </w:p>
     <w:p>
@@ -949,23 +856,12 @@
     </w:p>
     <w:p>
       <w:r>
-        <w:t>Ib为设计电流，In为过载保护额定值或整定值，Iz为实际安装载流量，It为表列载流量。第一式表达基本配合；第二式体现PPT列出的适用修正，BS 3036还需满足器件因素。各系数仅在适用时采用，特殊安装按表注处理。正式答案用文字说明此关系已足够。</w:t>
+        <w:t>It为所需表列载流量；In为保护器件额定电流；Ca、Cg、Ci、Cd分别为环境温度、成组、隔热及器件修正。系数小于1时，所需表列载流量增大，查表可能需要更大的截面。先按实际安装选择基准及适用系数，不重复计入同一安装影响。</w:t>
       </w:r>
     </w:p>
     <w:p>
       <w:r>
-        <w:t>Ib is design current, In the overload-device rating/setting, Iz installed capacity and It tabulated capacity. The first is basic coordination; the second includes the applicable PPT corrections, including the BS 3036 device factor. Use only relevant factors and follow special-installation notes. A verbal explanation is sufficient in the written answer.</w:t>
-      </w:r>
-    </w:p>
-    <w:p>
-      <w:pPr>
-        <w:pStyle w:val="Heading1"/>
-        <w:pageBreakBefore/>
-      </w:pPr>
-      <w:r>
-        <w:t>6 压降与损耗：为什么还要继续核查</w:t>
-        <w:br/>
-        <w:t>Why voltage drop and losses require separate checks</w:t>
+        <w:t>It is the required tabulated current rating; In is the protective-device rating. Ca, Cg, Ci and Cd represent ambient, grouping, insulation and device corrections. Factors below unity increase required It and may lead to a larger size. Match the base rating and applicable factors to the installation without duplicating an effect.</w:t>
       </w:r>
     </w:p>
     <w:p>
@@ -973,35 +869,17 @@
         <w:pStyle w:val="Heading2"/>
       </w:pPr>
       <w:r>
-        <w:t>A6(1)压降页 / The voltage-drop page</w:t>
+        <w:t>S83：示例仅用于理解查表 / Example for understanding table use</w:t>
       </w:r>
     </w:p>
     <w:p>
       <w:r>
-        <w:t>压降数据以mV/A/m表示，要匹配直流、单相或三相，以及电缆排列。大截面区分r、x、z，分别为电阻、电抗、阻抗，交流负载还要考虑功率因数。4mm²三相值为9.5，单相值为11，不能混用。增加间距虽可改善散热，但表注明超过Method 12规定间距会增加压降。</w:t>
+        <w:t>PPT给定三相、20A MCB、45°C、表面管道、40m线路；示例以20A负载和380V计算，上游压降1%。这些是课件例题条件，不能当作Q2已给定的参数。</w:t>
       </w:r>
     </w:p>
     <w:p>
       <w:r>
-        <w:t>Values in mV/A/m depend on d.c., single-phase or three-phase service and formation. Larger sizes distinguish resistance r, reactance x and impedance z; a.c. load power factor also matters. The 4mm² entries are 9.5 for three-phase and 11 for single-phase. Wider spacing can aid cooling but, beyond Method 12 spacing, increases voltage drop according to the note.</w:t>
-      </w:r>
-    </w:p>
-    <w:p>
-      <w:pPr>
-        <w:pStyle w:val="Heading2"/>
-      </w:pPr>
-      <w:r>
-        <w:t>PPT S83示例的判读 / Interpreting the S83 example</w:t>
-      </w:r>
-    </w:p>
-    <w:p>
-      <w:r>
-        <w:t>以下只是解释查表方法：PPT示例为三相、20A MCB、45°C、表面管道、40m线路，计算时取负载20A，系统380V，上游压降1%。这些不是Q2给定的工程参数。</w:t>
-      </w:r>
-    </w:p>
-    <w:p>
-      <w:r>
-        <w:t>This illustrates table use only. The PPT example uses three phases, a 20A MCB, 45°C ambient, surface conduit and a 40m route, with 20A load, 380V supply and 1% upstream drop. These are not design parameters supplied by Q2.</w:t>
+        <w:t>The PPT example specifies three phases, a 20A MCB, 45°C, surface conduit and a 40m route. Its calculation uses 20A load, 380V and 1% upstream drop. These are example conditions, not parameters supplied by Q2.</w:t>
       </w:r>
     </w:p>
     <w:tbl>
@@ -1058,9 +936,9 @@
               <w:rPr>
                 <w:sz w:val="20"/>
               </w:rPr>
-              <w:t>① 选择温度系数</w:t>
+              <w:t>① 温度修正</w:t>
               <w:br/>
-              <w:t>Temperature factor</w:t>
+              <w:t>Temperature</w:t>
             </w:r>
           </w:p>
         </w:tc>
@@ -1076,9 +954,9 @@
               <w:rPr>
                 <w:sz w:val="20"/>
               </w:rPr>
-              <w:t>MCB采用A5(1)，普通70°C PVC在45°C下Ca＝0.79；示例未给额外成组或隔热，其他有关系数取1。</w:t>
+              <w:t>A5(1)中Ca＝0.79，故It ≥ 20/0.79＝25.3A。</w:t>
               <w:br/>
-              <w:t>Use A5(1): Ca = 0.79 for ordinary 70°C PVC at 45°C; no additional grouping or insulation is assumed.</w:t>
+              <w:t>Ca = 0.79 from A5(1); required It ≥ 25.3A.</w:t>
             </w:r>
           </w:p>
         </w:tc>
@@ -1099,9 +977,9 @@
               <w:rPr>
                 <w:sz w:val="20"/>
               </w:rPr>
-              <w:t>② 确定所需表列值</w:t>
+              <w:t>② 查载流量</w:t>
               <w:br/>
-              <w:t>Required table rating</w:t>
+              <w:t>Current rating</w:t>
             </w:r>
           </w:p>
         </w:tc>
@@ -1117,9 +995,9 @@
               <w:rPr>
                 <w:sz w:val="20"/>
               </w:rPr>
-              <w:t>It ≥ 20 / 0.79 = 25.3A。表面管道采用参考Method 3；4mm²三相值28A满足载流量，2.5mm²的21A不足。</w:t>
+              <w:t>表面管道对应Method 3；A6(1)中4mm²三相值28A，满足25.3A需求。</w:t>
               <w:br/>
-              <w:t>It ≥ 25.3A. Surface conduit uses Method 3: 4mm² provides 28A, while 2.5mm² provides only 21A.</w:t>
+              <w:t>Surface conduit uses Method 3; the 4mm² three-phase rating is 28A, meeting 25.3A.</w:t>
             </w:r>
           </w:p>
         </w:tc>
@@ -1140,9 +1018,9 @@
               <w:rPr>
                 <w:sz w:val="20"/>
               </w:rPr>
-              <w:t>③ 再查压降</w:t>
+              <w:t>③ 查压降</w:t>
               <w:br/>
-              <w:t>Voltage-drop check</w:t>
+              <w:t>Voltage drop</w:t>
             </w:r>
           </w:p>
         </w:tc>
@@ -1158,9 +1036,9 @@
               <w:rPr>
                 <w:sz w:val="20"/>
               </w:rPr>
-              <w:t>ΔV = 9.5 × 20 × 40 / 1000 = 7.6V，约为380V的2%；加上上游1%，总计约3%。</w:t>
+              <w:t>同一电缆三相压降数据9.5mV/A/m：9.5×20×40/1000＝7.6V，约为380V的2%。</w:t>
               <w:br/>
-              <w:t>The drop is 7.6V, about 2% of 380V; including 1% upstream gives approximately 3%.</w:t>
+              <w:t>At 9.5mV/A/m, drop is 7.6V, about 2% of 380V.</w:t>
             </w:r>
           </w:p>
         </w:tc>
@@ -1181,9 +1059,9 @@
               <w:rPr>
                 <w:sz w:val="20"/>
               </w:rPr>
-              <w:t>④ 解释而非套用</w:t>
+              <w:t>④ 合并上游</w:t>
               <w:br/>
-              <w:t>Interpret, do not generalise</w:t>
+              <w:t>Include upstream</w:t>
             </w:r>
           </w:p>
         </w:tc>
@@ -1199,30 +1077,22 @@
               <w:rPr>
                 <w:sz w:val="20"/>
               </w:rPr>
-              <w:t>PPT S82的教学取值为总压降4%，因此本例通过该检查；4%属于课件所采用的条件，不代表所有工程都可直接采用。完整设计还需保护及环境检查。</w:t>
+              <w:t>PPT采用总压降4%；上游1%后余3%，本段约2%，符合例题条件。说明通过载流量后仍需查压降。</w:t>
               <w:br/>
-              <w:t>The example meets the 4% total-drop allowance adopted in S82. This is the course example condition, not a universal allowance. Full design still needs protection and environmental checks.</w:t>
+              <w:t>Under the example’s 4% total allowance, 1% upstream leaves 3%; approximately 2% meets that condition. Capacity and voltage drop are separate checks.</w:t>
             </w:r>
           </w:p>
         </w:tc>
       </w:tr>
     </w:tbl>
     <w:p>
-      <w:pPr>
-        <w:pStyle w:val="Heading2"/>
-      </w:pPr>
       <w:r>
-        <w:t>功率损耗 / Power loss</w:t>
+        <w:t>正式答案不需要写这组计算：题目要求的是影响因素及定性解释，例题只是说明为什么温度、安装方式、长度及负载都必须考虑。</w:t>
       </w:r>
     </w:p>
     <w:p>
       <w:r>
-        <w:t>PPT S79把载流量、压降和功率损耗并列为截面确定的三项标准。损耗随I²R增加，工业长时间运行会放大能源费用，因此正式答案保留能源效益这一独立因素。</w:t>
-      </w:r>
-    </w:p>
-    <w:p>
-      <w:r>
-        <w:t>S79 lists capacity, voltage drop and power loss as three sizing criteria. I²R losses become economically significant over long industrial operating hours, so energy efficiency remains a separate factor in the answer.</w:t>
+        <w:t>The written answer does not need these calculations. They explain why temperature, installation, length and loading matter to the qualitative task.</w:t>
       </w:r>
     </w:p>
     <w:p>
@@ -1231,353 +1101,9 @@
         <w:pageBreakBefore/>
       </w:pPr>
       <w:r>
-        <w:t>7 正式答案为何采用这12项</w:t>
+        <w:t>6 压降、损耗与最终答题范围</w:t>
         <w:br/>
-        <w:t>Why the written answer uses these 12 factors</w:t>
-      </w:r>
-    </w:p>
-    <w:tbl>
-      <w:tblPr>
-        <w:tblStyle w:val="TableGrid"/>
-        <w:tblW w:type="auto" w:w="0"/>
-        <w:tblLayout w:type="fixed"/>
-        <w:tblLook w:firstColumn="1" w:firstRow="1" w:lastColumn="0" w:lastRow="0" w:noHBand="0" w:noVBand="1" w:val="04A0"/>
-      </w:tblPr>
-      <w:tblGrid>
-        <w:gridCol w:w="2608"/>
-        <w:gridCol w:w="7540"/>
-      </w:tblGrid>
-      <w:tr>
-        <w:trPr>
-          <w:tblHeader/>
-        </w:trPr>
-        <w:tc>
-          <w:tcPr>
-            <w:tcW w:type="dxa" w:w="2608"/>
-            <w:shd w:fill="E8EEF4"/>
-          </w:tcPr>
-          <w:p>
-            <w:r>
-              <w:t>要点 / Point</w:t>
-            </w:r>
-          </w:p>
-        </w:tc>
-        <w:tc>
-          <w:tcPr>
-            <w:tcW w:type="dxa" w:w="7540"/>
-            <w:shd w:fill="E8EEF4"/>
-          </w:tcPr>
-          <w:p>
-            <w:r>
-              <w:t>判读及含义 / Interpretation</w:t>
-            </w:r>
-          </w:p>
-        </w:tc>
-      </w:tr>
-      <w:tr>
-        <w:trPr>
-          <w:cantSplit/>
-        </w:trPr>
-        <w:tc>
-          <w:tcPr>
-            <w:tcW w:type="dxa" w:w="2608"/>
-          </w:tcPr>
-          <w:p>
-            <w:pPr>
-              <w:spacing w:before="40" w:after="80" w:line="250" w:lineRule="auto"/>
-            </w:pPr>
-            <w:r>
-              <w:rPr>
-                <w:sz w:val="20"/>
-              </w:rPr>
-              <w:t>1–2 负载及规格</w:t>
-              <w:br/>
-              <w:t>Loading and specification</w:t>
-            </w:r>
-          </w:p>
-        </w:tc>
-        <w:tc>
-          <w:tcPr>
-            <w:tcW w:type="dxa" w:w="7540"/>
-          </w:tcPr>
-          <w:p>
-            <w:pPr>
-              <w:spacing w:before="40" w:after="80" w:line="250" w:lineRule="auto"/>
-            </w:pPr>
-            <w:r>
-              <w:rPr>
-                <w:sz w:val="20"/>
-              </w:rPr>
-              <w:t>先确定“要供多少电、用什么电缆”。负载、相制、导体和绝缘使后面的表格选择有意义。</w:t>
-              <w:br/>
-              <w:t>Establish the required supply and cable construction before selecting rating data.</w:t>
-            </w:r>
-          </w:p>
-        </w:tc>
-      </w:tr>
-      <w:tr>
-        <w:trPr>
-          <w:cantSplit/>
-        </w:trPr>
-        <w:tc>
-          <w:tcPr>
-            <w:tcW w:type="dxa" w:w="2608"/>
-          </w:tcPr>
-          <w:p>
-            <w:pPr>
-              <w:spacing w:before="40" w:after="80" w:line="250" w:lineRule="auto"/>
-            </w:pPr>
-            <w:r>
-              <w:rPr>
-                <w:sz w:val="20"/>
-              </w:rPr>
-              <w:t>3 安装方式</w:t>
-              <w:br/>
-              <w:t>Installation</w:t>
-            </w:r>
-          </w:p>
-        </w:tc>
-        <w:tc>
-          <w:tcPr>
-            <w:tcW w:type="dxa" w:w="7540"/>
-          </w:tcPr>
-          <w:p>
-            <w:pPr>
-              <w:spacing w:before="40" w:after="80" w:line="250" w:lineRule="auto"/>
-            </w:pPr>
-            <w:r>
-              <w:rPr>
-                <w:sz w:val="20"/>
-              </w:rPr>
-              <w:t>由Appendix 7对应A6(1)的参考栏位，解释同一截面为何有不同载流量。</w:t>
-              <w:br/>
-              <w:t>Link Appendix 7 to the A6(1) column and explain differing ratings for the same size.</w:t>
-            </w:r>
-          </w:p>
-        </w:tc>
-      </w:tr>
-      <w:tr>
-        <w:trPr>
-          <w:cantSplit/>
-        </w:trPr>
-        <w:tc>
-          <w:tcPr>
-            <w:tcW w:type="dxa" w:w="2608"/>
-          </w:tcPr>
-          <w:p>
-            <w:pPr>
-              <w:spacing w:before="40" w:after="80" w:line="250" w:lineRule="auto"/>
-            </w:pPr>
-            <w:r>
-              <w:rPr>
-                <w:sz w:val="20"/>
-              </w:rPr>
-              <w:t>4–7 热条件</w:t>
-              <w:br/>
-              <w:t>Thermal conditions</w:t>
-            </w:r>
-          </w:p>
-        </w:tc>
-        <w:tc>
-          <w:tcPr>
-            <w:tcW w:type="dxa" w:w="7540"/>
-          </w:tcPr>
-          <w:p>
-            <w:pPr>
-              <w:spacing w:before="40" w:after="80" w:line="250" w:lineRule="auto"/>
-            </w:pPr>
-            <w:r>
-              <w:rPr>
-                <w:sz w:val="20"/>
-              </w:rPr>
-              <w:t>分别涵盖A5(1)／A5(2)、A5(3)、A5(4)、A5(6)，避免把所有影响笼统写成“散热”。</w:t>
-              <w:br/>
-              <w:t>Cover temperature, grouping, insulation and trench corrections individually.</w:t>
-            </w:r>
-          </w:p>
-        </w:tc>
-      </w:tr>
-      <w:tr>
-        <w:trPr>
-          <w:cantSplit/>
-        </w:trPr>
-        <w:tc>
-          <w:tcPr>
-            <w:tcW w:type="dxa" w:w="2608"/>
-          </w:tcPr>
-          <w:p>
-            <w:pPr>
-              <w:spacing w:before="40" w:after="80" w:line="250" w:lineRule="auto"/>
-            </w:pPr>
-            <w:r>
-              <w:rPr>
-                <w:sz w:val="20"/>
-              </w:rPr>
-              <w:t>8 保护</w:t>
-              <w:br/>
-              <w:t>Protection</w:t>
-            </w:r>
-          </w:p>
-        </w:tc>
-        <w:tc>
-          <w:tcPr>
-            <w:tcW w:type="dxa" w:w="7540"/>
-          </w:tcPr>
-          <w:p>
-            <w:pPr>
-              <w:spacing w:before="40" w:after="80" w:line="250" w:lineRule="auto"/>
-            </w:pPr>
-            <w:r>
-              <w:rPr>
-                <w:sz w:val="20"/>
-              </w:rPr>
-              <w:t>覆盖A5(5)及PPT的In配合，并补足正常载流量以外的故障保护判断。</w:t>
-              <w:br/>
-              <w:t>Cover A5(5), device coordination and fault protection beyond normal current rating.</w:t>
-            </w:r>
-          </w:p>
-        </w:tc>
-      </w:tr>
-      <w:tr>
-        <w:trPr>
-          <w:cantSplit/>
-        </w:trPr>
-        <w:tc>
-          <w:tcPr>
-            <w:tcW w:type="dxa" w:w="2608"/>
-          </w:tcPr>
-          <w:p>
-            <w:pPr>
-              <w:spacing w:before="40" w:after="80" w:line="250" w:lineRule="auto"/>
-            </w:pPr>
-            <w:r>
-              <w:rPr>
-                <w:sz w:val="20"/>
-              </w:rPr>
-              <w:t>9 压降</w:t>
-              <w:br/>
-              <w:t>Voltage drop</w:t>
-            </w:r>
-          </w:p>
-        </w:tc>
-        <w:tc>
-          <w:tcPr>
-            <w:tcW w:type="dxa" w:w="7540"/>
-          </w:tcPr>
-          <w:p>
-            <w:pPr>
-              <w:spacing w:before="40" w:after="80" w:line="250" w:lineRule="auto"/>
-            </w:pPr>
-            <w:r>
-              <w:rPr>
-                <w:sz w:val="20"/>
-              </w:rPr>
-              <w:t>对应A6(1)压降页及PPT S82–S83；说明线路长度、相制、排列和启动情况的影响。</w:t>
-              <w:br/>
-              <w:t>Use the voltage-drop page and S82–S83 to explain length, phase, formation and motor starting.</w:t>
-            </w:r>
-          </w:p>
-        </w:tc>
-      </w:tr>
-      <w:tr>
-        <w:trPr>
-          <w:cantSplit/>
-        </w:trPr>
-        <w:tc>
-          <w:tcPr>
-            <w:tcW w:type="dxa" w:w="2608"/>
-          </w:tcPr>
-          <w:p>
-            <w:pPr>
-              <w:spacing w:before="40" w:after="80" w:line="250" w:lineRule="auto"/>
-            </w:pPr>
-            <w:r>
-              <w:rPr>
-                <w:sz w:val="20"/>
-              </w:rPr>
-              <w:t>10 工业条件</w:t>
-              <w:br/>
-              <w:t>Industrial service</w:t>
-            </w:r>
-          </w:p>
-        </w:tc>
-        <w:tc>
-          <w:tcPr>
-            <w:tcW w:type="dxa" w:w="7540"/>
-          </w:tcPr>
-          <w:p>
-            <w:pPr>
-              <w:spacing w:before="40" w:after="80" w:line="250" w:lineRule="auto"/>
-            </w:pPr>
-            <w:r>
-              <w:rPr>
-                <w:sz w:val="20"/>
-              </w:rPr>
-              <w:t>将外部影响具体化：油污、化学品、机械损伤、火灾及必要的供电连续性。</w:t>
-              <w:br/>
-              <w:t>Make external influences concrete through oil, chemicals, damage, fire and required continuity.</w:t>
-            </w:r>
-          </w:p>
-        </w:tc>
-      </w:tr>
-      <w:tr>
-        <w:trPr>
-          <w:cantSplit/>
-        </w:trPr>
-        <w:tc>
-          <w:tcPr>
-            <w:tcW w:type="dxa" w:w="2608"/>
-          </w:tcPr>
-          <w:p>
-            <w:pPr>
-              <w:spacing w:before="40" w:after="80" w:line="250" w:lineRule="auto"/>
-            </w:pPr>
-            <w:r>
-              <w:rPr>
-                <w:sz w:val="20"/>
-              </w:rPr>
-              <w:t>11–12 经济与实施</w:t>
-              <w:br/>
-              <w:t>Economy and installation practicality</w:t>
-            </w:r>
-          </w:p>
-        </w:tc>
-        <w:tc>
-          <w:tcPr>
-            <w:tcW w:type="dxa" w:w="7540"/>
-          </w:tcPr>
-          <w:p>
-            <w:pPr>
-              <w:spacing w:before="40" w:after="80" w:line="250" w:lineRule="auto"/>
-            </w:pPr>
-            <w:r>
-              <w:rPr>
-                <w:sz w:val="20"/>
-              </w:rPr>
-              <w:t>保留PPT的能源效益，并考虑端接、维修及新增回路后重新核查。</w:t>
-              <w:br/>
-              <w:t>Retain energy efficiency and address terminals, maintenance and reassessment after expansion.</w:t>
-            </w:r>
-          </w:p>
-        </w:tc>
-      </w:tr>
-    </w:tbl>
-    <w:p>
-      <w:pPr>
-        <w:pStyle w:val="Heading2"/>
-      </w:pPr>
-      <w:r>
-        <w:t>容易失分的写法 / Common weaknesses</w:t>
-      </w:r>
-    </w:p>
-    <w:p>
-      <w:r>
-        <w:t>①只列名称，没有解释原因及影响。②把A6(1)套用到所有电缆。③把某个Method或间距优惠任意推广。④将不适用系数或同一热效应重复相乘。⑤只检查载流量，遗漏压降和损耗。⑥照抄20A示例作为Q2最终答案。⑦写成逐表介绍，缺少工业应用因素。</w:t>
-      </w:r>
-    </w:p>
-    <w:p>
-      <w:r>
-        <w:t>Avoid: listing factors without causes or consequences; applying A6(1) to every cable; generalising Method or spacing concessions; multiplying inapplicable or duplicate factors; omitting voltage drop or losses; treating the 20A example as the Q2 answer; or describing tables without industrial application.</w:t>
+        <w:t>Voltage drop, loss and final answer scope</w:t>
       </w:r>
     </w:p>
     <w:p>
@@ -1585,17 +1111,100 @@
         <w:pStyle w:val="Heading2"/>
       </w:pPr>
       <w:r>
-        <w:t>抄写稿的使用范围 / Using the written answer</w:t>
+        <w:t>S82：长度为什么影响选线 / Why length affects selection</w:t>
+      </w:r>
+    </w:p>
+    <w:p>
+      <w:pPr>
+        <w:jc w:val="center"/>
+      </w:pPr>
+      <w:r>
+        <w:rPr>
+          <w:b/>
+          <w:sz w:val="24"/>
+        </w:rPr>
+        <w:t>ΔV = v × I</w:t>
+      </w:r>
+      <w:r>
+        <w:rPr>
+          <w:b/>
+          <w:sz w:val="24"/>
+          <w:vertAlign w:val="subscript"/>
+        </w:rPr>
+        <w:t>b</w:t>
+      </w:r>
+      <w:r>
+        <w:rPr>
+          <w:b/>
+          <w:sz w:val="24"/>
+        </w:rPr>
+        <w:t xml:space="preserve"> × L / 1000</w:t>
       </w:r>
     </w:p>
     <w:p>
       <w:r>
-        <w:t>另一份Word只有可直接写入答案的正文，没有上述审题说明、示例计算或分析提示。两份均保留中英对应，便于理解及选择作答语言；无需把本分析稿中的全部表注和数值另抄进正式答案。</w:t>
+        <w:t>v为表列压降数据（mV/A/m），Ib为设计电流（A），L为线路长度（m）。在表格适用条件下，电流或长度增大会增加压降。S82要求知道电缆类型、截面、安装方式、长度、交流／直流及负载，因此正文第9项覆盖这些变量。</w:t>
       </w:r>
     </w:p>
     <w:p>
       <w:r>
-        <w:t>The companion Word contains only the answer text, without these interpretation notes, worked calculations or study guidance. Both are bilingual for understanding and choice of answer language. The detailed notes and numerical examples here need not all be copied into the formal answer.</w:t>
+        <w:t>v is the tabulated voltage-drop value in mV/A/m, Ib the design current in A, and L the route length in m. Under the table’s conditions, greater current or length increases drop. S82 requires type, size, installation, length, a.c./d.c. circuit and load; factor 9 covers these inputs.</w:t>
+      </w:r>
+    </w:p>
+    <w:p>
+      <w:r>
+        <w:t>S82采用电源调压6%、设备容许10%，得出配电系统4%；另列实践分配为上升干线1.5%、馈线／最终回路2.5%。S83按已知上游1%分配余下3%。这些是课件中的条件和分配，定性答案无需逐个抄出，也不把它们表述为所有工程的统一数值。</w:t>
+      </w:r>
+    </w:p>
+    <w:p>
+      <w:r>
+        <w:t>S82 derives 4% for distribution from 6% source regulation and 10% equipment allowance, and lists a practical split of 1.5% rising mains and 2.5% feeder/final circuit. S83 allocates 3% after its specified 1% upstream drop. These are course conditions and allocations, not universal design values, and need not be reproduced in a qualitative answer.</w:t>
+      </w:r>
+    </w:p>
+    <w:p>
+      <w:pPr>
+        <w:pStyle w:val="Heading2"/>
+      </w:pPr>
+      <w:r>
+        <w:t>S79–S80：为何保留损耗 / Why retain losses</w:t>
+      </w:r>
+    </w:p>
+    <w:p>
+      <w:r>
+        <w:t>PPT将功率损耗列为截面标准，将能源效益列为选线因素。因此第10项必须保留。其定性含义是：同一电流下，降低电阻可降低损耗，增大截面是影响电阻的方式之一；不用增加经济计算或课件之外的设计要求。</w:t>
+      </w:r>
+    </w:p>
+    <w:p>
+      <w:r>
+        <w:t>The PPT names power loss as a sizing criterion and energy efficiency as a selection factor, so factor 10 is retained. Qualitatively, lower resistance reduces loss at the same current, and cross-section affects resistance. No additional economic calculation or design requirement is needed.</w:t>
+      </w:r>
+    </w:p>
+    <w:p>
+      <w:pPr>
+        <w:pStyle w:val="Heading2"/>
+      </w:pPr>
+      <w:r>
+        <w:t>正式答案的组织方式 / Organisation of the written answer</w:t>
+      </w:r>
+    </w:p>
+    <w:p>
+      <w:r>
+        <w:t>前3项解释“选择什么电缆、在什么条件下安装”；第4–8项解释“负载及热条件如何决定所需载流量”；第9–10项补齐“压降和损耗”两项标准。每项都包含因素、影响及选型结果。这样覆盖PPT的全部选线框架，同时保持题目要求的定性层次。</w:t>
+      </w:r>
+    </w:p>
+    <w:p>
+      <w:r>
+        <w:t>Factors 1–3 address cable choice and installation; 4–8 explain how demand and thermal conditions determine current-rating needs; 9–10 complete the voltage-drop and power-loss criteria. Each links a factor to its effect and selection consequence, covering the PPT framework at the requested qualitative level.</w:t>
+      </w:r>
+    </w:p>
+    <w:p>
+      <w:r>
+        <w:t>另一份Word仅保留可抄写的中英答案，不含本稿的页码对应、审题提示及例题计算。</w:t>
+      </w:r>
+    </w:p>
+    <w:p>
+      <w:r>
+        <w:t>The companion Word contains only the bilingual written answer, without slide mapping, interpretation notes or worked calculations.</w:t>
       </w:r>
     </w:p>
     <w:sectPr>

</xml_diff>

<commit_message>
Organize Q2 into numbered selection and sizing sections; explain all three extracts at the end of analysis
</commit_message>
<xml_diff>
--- a/downloads/PIA5704/PIA5704_Q2_Answer_Analysis.docx
+++ b/downloads/PIA5704/PIA5704_Q2_Answer_Analysis.docx
@@ -4,12 +4,20 @@
   <w:body>
     <w:p>
       <w:pPr>
+        <w:pStyle w:val="Title"/>
+      </w:pPr>
+      <w:r>
+        <w:t>Q2 答案解析 / Answer analysis</w:t>
+      </w:r>
+    </w:p>
+    <w:p>
+      <w:pPr>
         <w:pStyle w:val="Heading1"/>
       </w:pPr>
       <w:r>
-        <w:t>Q2 审题及PPT内容对应</w:t>
+        <w:t>【1】题目要求与答案结构</w:t>
         <w:br/>
-        <w:t>Question interpretation and PPT mapping</w:t>
+        <w:t>Question requirements and answer structure</w:t>
       </w:r>
     </w:p>
     <w:p>
@@ -17,17 +25,17 @@
         <w:pStyle w:val="Heading2"/>
       </w:pPr>
       <w:r>
-        <w:t>1 审题 / Interpreting the task</w:t>
+        <w:t>（1）Selection：选择什么电缆 / Choosing the cable</w:t>
       </w:r>
     </w:p>
     <w:p>
       <w:r>
-        <w:t>题目要求列出工业电缆选型及截面的影响因素，并解释原因；无需逐项抄表或计算一个最终截面。</w:t>
+        <w:t>回答导体、芯数、绝缘、护套、铠装及安装方式。对应PPT《Electrical Distribution System II》S78和S80。正式答案【1】用三项覆盖结构、环境与敷设，避免把材料选择和截面计算混写。</w:t>
       </w:r>
     </w:p>
     <w:p>
       <w:r>
-        <w:t>List factors affecting industrial cable selection and sizing and explain their effects qualitatively. Reproducing every table or calculating a final cable size is unnecessary.</w:t>
+        <w:t>Address conductor, cores, insulation, sheath, armour and installation, following Electrical Distribution System II, S78 and S80. Written-answer section 【1】groups these into construction, environment and installation.</w:t>
       </w:r>
     </w:p>
     <w:p>
@@ -35,17 +43,17 @@
         <w:pStyle w:val="Heading2"/>
       </w:pPr>
       <w:r>
-        <w:t>2 本版内容边界 / Scope of this revision</w:t>
+        <w:t>（2）Sizing：截面须满足什么条件 / Requirements governing size</w:t>
       </w:r>
     </w:p>
     <w:p>
       <w:r>
-        <w:t>正文以《Electrical Distribution System II》S78–S83的Cable及Cable Sizing内容为限。题目指定的三份图表用于识别安装方式、查载流量、压降及修正系数，不把图表的每项细节扩展成新的答题主题。</w:t>
+        <w:t>S79将载流量（热问题）、压降、功率损耗列为三项截面标准。S81进一步列出Ib、In、Ca、Cg、Ci及长度，并包含Cd。正式答案【2】据此分为七项，没有增加额外的独立工程设计主题。</w:t>
       </w:r>
     </w:p>
     <w:p>
       <w:r>
-        <w:t>The answer follows Cable and Cable Sizing in Electrical Distribution System II, S78–S83. The three supplied extracts support identification of installation methods, current and voltage-drop ratings, and correction factors; every table detail is not made into an additional answer topic.</w:t>
+        <w:t>S79 gives capacity, voltage drop and power loss as three sizing criteria. S81 lists Ib, In, Ca, Cg, Ci and length, with Cd in its relation. Written-answer section 【2】organises these into seven factors without adding independent design topics.</w:t>
       </w:r>
     </w:p>
     <w:p>
@@ -53,25 +61,27 @@
         <w:pStyle w:val="Heading2"/>
       </w:pPr>
       <w:r>
-        <w:t>3 先区分选型和截面 / Selection versus sizing</w:t>
+        <w:t>（3）Qualitative explanations：写原因及影响 / Explain causes and effects</w:t>
       </w:r>
     </w:p>
     <w:p>
       <w:r>
-        <w:t>S78说明结构选型；S79列载流量、压降、损耗三项截面标准；S80列外部影响、安装、负载、压降及能源效益。正文框架直接来自这些项目。</w:t>
+        <w:t>每项都要写“因素是什么、怎样影响电缆、会怎样影响选型或截面”。例如：成组增加互热，降低可用载流量，因此可能增大截面。题目没有给出完整负载及线路参数，不要求算出唯一mm²结果。</w:t>
       </w:r>
     </w:p>
     <w:p>
       <w:r>
-        <w:t>S78 covers construction; S79 gives capacity, voltage drop and power loss as sizing criteria; S80 lists external influences, installation, loading, voltage drop and efficiency. These establish the answer framework.</w:t>
+        <w:t>For each factor, state what it is, how it affects the cable, and the selection consequence. For example, grouping increases mutual heating, reduces capacity and may require a larger size. No unique mm² result is possible without complete circuit parameters.</w:t>
       </w:r>
     </w:p>
     <w:p>
       <w:pPr>
-        <w:pStyle w:val="Heading2"/>
+        <w:pStyle w:val="Heading1"/>
       </w:pPr>
       <w:r>
-        <w:t>正式答案第1–5项对应 / Mapping factors 1–5</w:t>
+        <w:t>【2】正式答案【1】的依据</w:t>
+        <w:br/>
+        <w:t>Basis of the cable-selection section</w:t>
       </w:r>
     </w:p>
     <w:tbl>
@@ -128,9 +138,9 @@
               <w:rPr>
                 <w:sz w:val="20"/>
               </w:rPr>
-              <w:t>1 结构及材料</w:t>
+              <w:t>（1）材料及结构</w:t>
               <w:br/>
-              <w:t>Construction</w:t>
+              <w:t>Materials and construction</w:t>
             </w:r>
           </w:p>
         </w:tc>
@@ -146,9 +156,9 @@
               <w:rPr>
                 <w:sz w:val="20"/>
               </w:rPr>
-              <w:t>S78、S80：铜／铝、芯数、PVC／XLPE、护套及铠装；解释为什么必须使用匹配电缆类型的额定资料。</w:t>
+              <w:t>S78：铜／铝、芯数、PVC／XLPE、护套、铠装、电阻及电抗。说明为何必须采用匹配电缆类型的额定资料。</w:t>
               <w:br/>
-              <w:t>S78/S80: material, cores, insulation, sheath and armour; use rating data matching the selected type.</w:t>
+              <w:t>S78 lists materials, cores, insulation, sheath, armour, resistance and reactance; ratings must match the type.</w:t>
             </w:r>
           </w:p>
         </w:tc>
@@ -169,7 +179,7 @@
               <w:rPr>
                 <w:sz w:val="20"/>
               </w:rPr>
-              <w:t>2 外部影响</w:t>
+              <w:t>（2）外部环境</w:t>
               <w:br/>
               <w:t>External influences</w:t>
             </w:r>
@@ -187,9 +197,9 @@
               <w:rPr>
                 <w:sz w:val="20"/>
               </w:rPr>
-              <w:t>S80：评估环境条件及一般特性，以指定适当设备。正文保持该层次，不另列课件未展开的专门要求。</w:t>
+              <w:t>S80要求评估环境条件及一般特性，以选合适设备。正文保持该范围，说明环境影响结构选择。</w:t>
               <w:br/>
-              <w:t>S80: assess environmental conditions and general characteristics for suitable selection; retain that level of detail.</w:t>
+              <w:t>S80 requires assessment of environmental conditions and general characteristics for suitable selection.</w:t>
             </w:r>
           </w:p>
         </w:tc>
@@ -210,7 +220,7 @@
               <w:rPr>
                 <w:sz w:val="20"/>
               </w:rPr>
-              <w:t>3 安装方式</w:t>
+              <w:t>（3）安装方式</w:t>
               <w:br/>
               <w:t>Installation</w:t>
             </w:r>
@@ -228,91 +238,9 @@
               <w:rPr>
                 <w:sz w:val="20"/>
               </w:rPr>
-              <w:t>S80–S81：先选电缆类型及安装方式，再查载流量；Appendix 7辅助确定参考Method。</w:t>
+              <w:t>S80–S81要求先选类型及安装方式；Appendix 7连接实际敷设与参考Method，A6(1)据此查栏位。</w:t>
               <w:br/>
-              <w:t>S80–S81: select type and installation before rating; Appendix 7 identifies the reference Method.</w:t>
-            </w:r>
-          </w:p>
-        </w:tc>
-      </w:tr>
-      <w:tr>
-        <w:trPr>
-          <w:cantSplit/>
-        </w:trPr>
-        <w:tc>
-          <w:tcPr>
-            <w:tcW w:type="dxa" w:w="2608"/>
-          </w:tcPr>
-          <w:p>
-            <w:pPr>
-              <w:spacing w:before="40" w:after="80" w:line="250" w:lineRule="auto"/>
-            </w:pPr>
-            <w:r>
-              <w:rPr>
-                <w:sz w:val="20"/>
-              </w:rPr>
-              <w:t>4 负载</w:t>
-              <w:br/>
-              <w:t>Loading</w:t>
-            </w:r>
-          </w:p>
-        </w:tc>
-        <w:tc>
-          <w:tcPr>
-            <w:tcW w:type="dxa" w:w="7540"/>
-          </w:tcPr>
-          <w:p>
-            <w:pPr>
-              <w:spacing w:before="40" w:after="80" w:line="250" w:lineRule="auto"/>
-            </w:pPr>
-            <w:r>
-              <w:rPr>
-                <w:sz w:val="20"/>
-              </w:rPr>
-              <w:t>S80–S81：Loading及Ib决定电流需求。解释电流增加与导体温升、截面之间的关系。</w:t>
-              <w:br/>
-              <w:t>S80–S81: loading and Ib establish demand; explain the relation to heating and size.</w:t>
-            </w:r>
-          </w:p>
-        </w:tc>
-      </w:tr>
-      <w:tr>
-        <w:trPr>
-          <w:cantSplit/>
-        </w:trPr>
-        <w:tc>
-          <w:tcPr>
-            <w:tcW w:type="dxa" w:w="2608"/>
-          </w:tcPr>
-          <w:p>
-            <w:pPr>
-              <w:spacing w:before="40" w:after="80" w:line="250" w:lineRule="auto"/>
-            </w:pPr>
-            <w:r>
-              <w:rPr>
-                <w:sz w:val="20"/>
-              </w:rPr>
-              <w:t>5 温度</w:t>
-              <w:br/>
-              <w:t>Temperature</w:t>
-            </w:r>
-          </w:p>
-        </w:tc>
-        <w:tc>
-          <w:tcPr>
-            <w:tcW w:type="dxa" w:w="7540"/>
-          </w:tcPr>
-          <w:p>
-            <w:pPr>
-              <w:spacing w:before="40" w:after="80" w:line="250" w:lineRule="auto"/>
-            </w:pPr>
-            <w:r>
-              <w:rPr>
-                <w:sz w:val="20"/>
-              </w:rPr>
-              <w:t>S81：Ca；S83示例以45°C及Ca＝0.79说明修正后的选线要求。</w:t>
-              <w:br/>
-              <w:t>S81: Ca; S83 illustrates it with 45°C and Ca = 0.79.</w:t>
+              <w:t>S80–S81 establish type and installation; Appendix 7 links the arrangement to the rating Method in A6(1).</w:t>
             </w:r>
           </w:p>
         </w:tc>
@@ -324,424 +252,9 @@
         <w:pageBreakBefore/>
       </w:pPr>
       <w:r>
-        <w:t>4 其余因素及三组图表的作用</w:t>
+        <w:t>【3】正式答案【2】的载流量部分</w:t>
         <w:br/>
-        <w:t>Remaining factors and the three table groups</w:t>
-      </w:r>
-    </w:p>
-    <w:tbl>
-      <w:tblPr>
-        <w:tblStyle w:val="TableGrid"/>
-        <w:tblW w:type="auto" w:w="0"/>
-        <w:tblLayout w:type="fixed"/>
-        <w:tblLook w:firstColumn="1" w:firstRow="1" w:lastColumn="0" w:lastRow="0" w:noHBand="0" w:noVBand="1" w:val="04A0"/>
-      </w:tblPr>
-      <w:tblGrid>
-        <w:gridCol w:w="2608"/>
-        <w:gridCol w:w="7540"/>
-      </w:tblGrid>
-      <w:tr>
-        <w:trPr>
-          <w:tblHeader/>
-        </w:trPr>
-        <w:tc>
-          <w:tcPr>
-            <w:tcW w:type="dxa" w:w="2608"/>
-            <w:shd w:fill="E8EEF4"/>
-          </w:tcPr>
-          <w:p>
-            <w:r>
-              <w:t>要点 / Point</w:t>
-            </w:r>
-          </w:p>
-        </w:tc>
-        <w:tc>
-          <w:tcPr>
-            <w:tcW w:type="dxa" w:w="7540"/>
-            <w:shd w:fill="E8EEF4"/>
-          </w:tcPr>
-          <w:p>
-            <w:r>
-              <w:t>判读及含义 / Interpretation</w:t>
-            </w:r>
-          </w:p>
-        </w:tc>
-      </w:tr>
-      <w:tr>
-        <w:trPr>
-          <w:cantSplit/>
-        </w:trPr>
-        <w:tc>
-          <w:tcPr>
-            <w:tcW w:type="dxa" w:w="2608"/>
-          </w:tcPr>
-          <w:p>
-            <w:pPr>
-              <w:spacing w:before="40" w:after="80" w:line="250" w:lineRule="auto"/>
-            </w:pPr>
-            <w:r>
-              <w:rPr>
-                <w:sz w:val="20"/>
-              </w:rPr>
-              <w:t>6 成组 / Grouping</w:t>
-            </w:r>
-          </w:p>
-        </w:tc>
-        <w:tc>
-          <w:tcPr>
-            <w:tcW w:type="dxa" w:w="7540"/>
-          </w:tcPr>
-          <w:p>
-            <w:pPr>
-              <w:spacing w:before="40" w:after="80" w:line="250" w:lineRule="auto"/>
-            </w:pPr>
-            <w:r>
-              <w:rPr>
-                <w:sz w:val="20"/>
-              </w:rPr>
-              <w:t>S81明确指出围护或成束回路的Cg可使截面显著增加，并给出It ≥ In/Cg。答案解释其原因是互相加热。</w:t>
-              <w:br/>
-              <w:t>S81 states that Cg for enclosed/bunched circuits may significantly increase size and gives It ≥ In/Cg; the explanation is mutual heating.</w:t>
-            </w:r>
-          </w:p>
-        </w:tc>
-      </w:tr>
-      <w:tr>
-        <w:trPr>
-          <w:cantSplit/>
-        </w:trPr>
-        <w:tc>
-          <w:tcPr>
-            <w:tcW w:type="dxa" w:w="2608"/>
-          </w:tcPr>
-          <w:p>
-            <w:pPr>
-              <w:spacing w:before="40" w:after="80" w:line="250" w:lineRule="auto"/>
-            </w:pPr>
-            <w:r>
-              <w:rPr>
-                <w:sz w:val="20"/>
-              </w:rPr>
-              <w:t>7 隔热 / Insulation</w:t>
-            </w:r>
-          </w:p>
-        </w:tc>
-        <w:tc>
-          <w:tcPr>
-            <w:tcW w:type="dxa" w:w="7540"/>
-          </w:tcPr>
-          <w:p>
-            <w:pPr>
-              <w:spacing w:before="40" w:after="80" w:line="250" w:lineRule="auto"/>
-            </w:pPr>
-            <w:r>
-              <w:rPr>
-                <w:sz w:val="20"/>
-              </w:rPr>
-              <w:t>S81列Ci。答案只解释隔热阻碍散热及影响额定值，不扩展成完整隔热设计计算。</w:t>
-              <w:br/>
-              <w:t>S81 lists Ci; explain restricted cooling and the rating effect without adding a full insulation-design exercise.</w:t>
-            </w:r>
-          </w:p>
-        </w:tc>
-      </w:tr>
-      <w:tr>
-        <w:trPr>
-          <w:cantSplit/>
-        </w:trPr>
-        <w:tc>
-          <w:tcPr>
-            <w:tcW w:type="dxa" w:w="2608"/>
-          </w:tcPr>
-          <w:p>
-            <w:pPr>
-              <w:spacing w:before="40" w:after="80" w:line="250" w:lineRule="auto"/>
-            </w:pPr>
-            <w:r>
-              <w:rPr>
-                <w:sz w:val="20"/>
-              </w:rPr>
-              <w:t>8 保护器件</w:t>
-              <w:br/>
-              <w:t>Protective device</w:t>
-            </w:r>
-          </w:p>
-        </w:tc>
-        <w:tc>
-          <w:tcPr>
-            <w:tcW w:type="dxa" w:w="7540"/>
-          </w:tcPr>
-          <w:p>
-            <w:pPr>
-              <w:spacing w:before="40" w:after="80" w:line="250" w:lineRule="auto"/>
-            </w:pPr>
-            <w:r>
-              <w:rPr>
-                <w:sz w:val="20"/>
-              </w:rPr>
-              <w:t>S81列In及Cd，半封闭熔断器Cd＝0.725，并给出It的修正关系。</w:t>
-              <w:br/>
-              <w:t>S81 lists In and Cd, gives Cd = 0.725 for semi-enclosed fuses, and relates them to required It.</w:t>
-            </w:r>
-          </w:p>
-        </w:tc>
-      </w:tr>
-      <w:tr>
-        <w:trPr>
-          <w:cantSplit/>
-        </w:trPr>
-        <w:tc>
-          <w:tcPr>
-            <w:tcW w:type="dxa" w:w="2608"/>
-          </w:tcPr>
-          <w:p>
-            <w:pPr>
-              <w:spacing w:before="40" w:after="80" w:line="250" w:lineRule="auto"/>
-            </w:pPr>
-            <w:r>
-              <w:rPr>
-                <w:sz w:val="20"/>
-              </w:rPr>
-              <w:t>9 长度及压降</w:t>
-              <w:br/>
-              <w:t>Length and voltage drop</w:t>
-            </w:r>
-          </w:p>
-        </w:tc>
-        <w:tc>
-          <w:tcPr>
-            <w:tcW w:type="dxa" w:w="7540"/>
-          </w:tcPr>
-          <w:p>
-            <w:pPr>
-              <w:spacing w:before="40" w:after="80" w:line="250" w:lineRule="auto"/>
-            </w:pPr>
-            <w:r>
-              <w:rPr>
-                <w:sz w:val="20"/>
-              </w:rPr>
-              <w:t>S81列长度；S82给压降资料及公式；S83把上游压降纳入示例。</w:t>
-              <w:br/>
-              <w:t>S81 lists length; S82 supplies voltage-drop inputs and equation; S83 allows for upstream drop.</w:t>
-            </w:r>
-          </w:p>
-        </w:tc>
-      </w:tr>
-      <w:tr>
-        <w:trPr>
-          <w:cantSplit/>
-        </w:trPr>
-        <w:tc>
-          <w:tcPr>
-            <w:tcW w:type="dxa" w:w="2608"/>
-          </w:tcPr>
-          <w:p>
-            <w:pPr>
-              <w:spacing w:before="40" w:after="80" w:line="250" w:lineRule="auto"/>
-            </w:pPr>
-            <w:r>
-              <w:rPr>
-                <w:sz w:val="20"/>
-              </w:rPr>
-              <w:t>10 损耗及能源效益</w:t>
-              <w:br/>
-              <w:t>Loss and efficiency</w:t>
-            </w:r>
-          </w:p>
-        </w:tc>
-        <w:tc>
-          <w:tcPr>
-            <w:tcW w:type="dxa" w:w="7540"/>
-          </w:tcPr>
-          <w:p>
-            <w:pPr>
-              <w:spacing w:before="40" w:after="80" w:line="250" w:lineRule="auto"/>
-            </w:pPr>
-            <w:r>
-              <w:rPr>
-                <w:sz w:val="20"/>
-              </w:rPr>
-              <w:t>S79列Power loss，S80列Energy efficiency。电阻及截面之间的解释用于说明该因素为何影响选线。</w:t>
-              <w:br/>
-              <w:t>S79 lists power loss and S80 energy efficiency; relate resistance and cross-section to the selection consequence.</w:t>
-            </w:r>
-          </w:p>
-        </w:tc>
-      </w:tr>
-    </w:tbl>
-    <w:p>
-      <w:pPr>
-        <w:pStyle w:val="Heading2"/>
-      </w:pPr>
-      <w:r>
-        <w:t>三组表各解决什么问题 / What each table group determines</w:t>
-      </w:r>
-    </w:p>
-    <w:tbl>
-      <w:tblPr>
-        <w:tblStyle w:val="TableGrid"/>
-        <w:tblW w:type="auto" w:w="0"/>
-        <w:tblLayout w:type="fixed"/>
-        <w:tblLook w:firstColumn="1" w:firstRow="1" w:lastColumn="0" w:lastRow="0" w:noHBand="0" w:noVBand="1" w:val="04A0"/>
-      </w:tblPr>
-      <w:tblGrid>
-        <w:gridCol w:w="2608"/>
-        <w:gridCol w:w="7540"/>
-      </w:tblGrid>
-      <w:tr>
-        <w:trPr>
-          <w:tblHeader/>
-        </w:trPr>
-        <w:tc>
-          <w:tcPr>
-            <w:tcW w:type="dxa" w:w="2608"/>
-            <w:shd w:fill="E8EEF4"/>
-          </w:tcPr>
-          <w:p>
-            <w:r>
-              <w:t>要点 / Point</w:t>
-            </w:r>
-          </w:p>
-        </w:tc>
-        <w:tc>
-          <w:tcPr>
-            <w:tcW w:type="dxa" w:w="7540"/>
-            <w:shd w:fill="E8EEF4"/>
-          </w:tcPr>
-          <w:p>
-            <w:r>
-              <w:t>判读及含义 / Interpretation</w:t>
-            </w:r>
-          </w:p>
-        </w:tc>
-      </w:tr>
-      <w:tr>
-        <w:trPr>
-          <w:cantSplit/>
-        </w:trPr>
-        <w:tc>
-          <w:tcPr>
-            <w:tcW w:type="dxa" w:w="2608"/>
-          </w:tcPr>
-          <w:p>
-            <w:pPr>
-              <w:spacing w:before="40" w:after="80" w:line="250" w:lineRule="auto"/>
-            </w:pPr>
-            <w:r>
-              <w:rPr>
-                <w:sz w:val="20"/>
-              </w:rPr>
-              <w:t>Appendix 7</w:t>
-            </w:r>
-          </w:p>
-        </w:tc>
-        <w:tc>
-          <w:tcPr>
-            <w:tcW w:type="dxa" w:w="7540"/>
-          </w:tcPr>
-          <w:p>
-            <w:pPr>
-              <w:spacing w:before="40" w:after="80" w:line="250" w:lineRule="auto"/>
-            </w:pPr>
-            <w:r>
-              <w:rPr>
-                <w:sz w:val="20"/>
-              </w:rPr>
-              <w:t>确定实际安装条件对应的参考Method，再选A6(1)栏位。不同安装方式的散热不同。</w:t>
-              <w:br/>
-              <w:t>Identify the reference Method for the actual installation, then select the A6(1) column; installation changes cooling.</w:t>
-            </w:r>
-          </w:p>
-        </w:tc>
-      </w:tr>
-      <w:tr>
-        <w:trPr>
-          <w:cantSplit/>
-        </w:trPr>
-        <w:tc>
-          <w:tcPr>
-            <w:tcW w:type="dxa" w:w="2608"/>
-          </w:tcPr>
-          <w:p>
-            <w:pPr>
-              <w:spacing w:before="40" w:after="80" w:line="250" w:lineRule="auto"/>
-            </w:pPr>
-            <w:r>
-              <w:rPr>
-                <w:sz w:val="20"/>
-              </w:rPr>
-              <w:t>Table A6(1)</w:t>
-            </w:r>
-          </w:p>
-        </w:tc>
-        <w:tc>
-          <w:tcPr>
-            <w:tcW w:type="dxa" w:w="7540"/>
-          </w:tcPr>
-          <w:p>
-            <w:pPr>
-              <w:spacing w:before="40" w:after="80" w:line="250" w:lineRule="auto"/>
-            </w:pPr>
-            <w:r>
-              <w:rPr>
-                <w:sz w:val="20"/>
-              </w:rPr>
-              <w:t>按电缆类型、截面、参考Method及相制选载流量；压降页另按相制及排列选值。表头为单芯、PVC绝缘、非铠装铜电缆，参考环境30°C、导体70°C。</w:t>
-              <w:br/>
-              <w:t>Select current ratings by type, size, Method and phase; use the corresponding voltage-drop data. The main table covers single-core, PVC-insulated, non-armoured copper cable at 30°C ambient/70°C conductor temperature.</w:t>
-            </w:r>
-          </w:p>
-        </w:tc>
-      </w:tr>
-      <w:tr>
-        <w:trPr>
-          <w:cantSplit/>
-        </w:trPr>
-        <w:tc>
-          <w:tcPr>
-            <w:tcW w:type="dxa" w:w="2608"/>
-          </w:tcPr>
-          <w:p>
-            <w:pPr>
-              <w:spacing w:before="40" w:after="80" w:line="250" w:lineRule="auto"/>
-            </w:pPr>
-            <w:r>
-              <w:rPr>
-                <w:sz w:val="20"/>
-              </w:rPr>
-              <w:t>Correction tables</w:t>
-            </w:r>
-          </w:p>
-        </w:tc>
-        <w:tc>
-          <w:tcPr>
-            <w:tcW w:type="dxa" w:w="7540"/>
-          </w:tcPr>
-          <w:p>
-            <w:pPr>
-              <w:spacing w:before="40" w:after="80" w:line="250" w:lineRule="auto"/>
-            </w:pPr>
-            <w:r>
-              <w:rPr>
-                <w:sz w:val="20"/>
-              </w:rPr>
-              <w:t>为S81中的Ca、Cg、Ci、Cd提供适用资料。A5(1)／A5(2)区分温度修正的保护条件；A5(3)、A5(4)、A5(5)分别对应成组、隔热及器件类型。各表只在适用时采用。</w:t>
-              <w:br/>
-              <w:t>Provide applicable Ca, Cg, Ci and Cd data. A5(1)/A5(2) distinguish protection conditions for temperature correction; A5(3), A5(4) and A5(5) cover grouping, insulation and device type. Apply each only where relevant.</w:t>
-            </w:r>
-          </w:p>
-        </w:tc>
-      </w:tr>
-    </w:tbl>
-    <w:p>
-      <w:pPr>
-        <w:pStyle w:val="Heading1"/>
-        <w:pageBreakBefore/>
-      </w:pPr>
-      <w:r>
-        <w:t>5 PPT载流量关系及示例判读</w:t>
-        <w:br/>
-        <w:t>PPT current-rating relation and example</w:t>
+        <w:t>Current-capacity factors in the sizing section</w:t>
       </w:r>
     </w:p>
     <w:p>
@@ -749,7 +262,25 @@
         <w:pStyle w:val="Heading2"/>
       </w:pPr>
       <w:r>
-        <w:t>S81：修正关系 / Correction relation</w:t>
+        <w:t>（1）Ib、In与It的区别 / Distinguishing the currents</w:t>
+      </w:r>
+    </w:p>
+    <w:p>
+      <w:r>
+        <w:t>Ib是设计电流；In是保护器件额定电流；It是选线所需的表列载流量。负载决定Ib，S81的选线关系用In及修正系数求It，然后在匹配安装方式的表中选择足够额定值。三者不能当作同一个数。</w:t>
+      </w:r>
+    </w:p>
+    <w:p>
+      <w:r>
+        <w:t>Ib is design current, In the protective-device rating, and It the required tabulated cable capacity. Loading establishes Ib; S81 uses In and corrections to determine It, then selects a sufficient rating for the installation. They are distinct quantities.</w:t>
+      </w:r>
+    </w:p>
+    <w:p>
+      <w:pPr>
+        <w:pStyle w:val="Heading2"/>
+      </w:pPr>
+      <w:r>
+        <w:t>S81的关系 / The S81 relation</w:t>
       </w:r>
     </w:p>
     <w:p>
@@ -856,12 +387,12 @@
     </w:p>
     <w:p>
       <w:r>
-        <w:t>It为所需表列载流量；In为保护器件额定电流；Ca、Cg、Ci、Cd分别为环境温度、成组、隔热及器件修正。系数小于1时，所需表列载流量增大，查表可能需要更大的截面。先按实际安装选择基准及适用系数，不重复计入同一安装影响。</w:t>
+        <w:t>上式用于说明适用系数降低时，所需表列额定值上升。应先确定实际安装及基准额定值，各系数仅在适用时采用；不重复计算同一热影响。</w:t>
       </w:r>
     </w:p>
     <w:p>
       <w:r>
-        <w:t>It is the required tabulated current rating; In is the protective-device rating. Ca, Cg, Ci and Cd represent ambient, grouping, insulation and device corrections. Factors below unity increase required It and may lead to a larger size. Match the base rating and applicable factors to the installation without duplicating an effect.</w:t>
+        <w:t>The relation shows why lower applicable factors increase the required tabulated rating. Establish the actual installation and base rating first; apply relevant factors without duplicating a thermal effect.</w:t>
       </w:r>
     </w:p>
     <w:p>
@@ -869,17 +400,173 @@
         <w:pStyle w:val="Heading2"/>
       </w:pPr>
       <w:r>
-        <w:t>S83：示例仅用于理解查表 / Example for understanding table use</w:t>
+        <w:t>（2）Ca：环境温度 / Ambient temperature</w:t>
       </w:r>
     </w:p>
     <w:p>
       <w:r>
-        <w:t>PPT给定三相、20A MCB、45°C、表面管道、40m线路；示例以20A负载和380V计算，上游压降1%。这些是课件例题条件，不能当作Q2已给定的参数。</w:t>
+        <w:t>来自S81。所给A5(1)用于仅作短路保护及一般过载保护；BS 3036半封闭熔断器承担过载保护时采用A5(2)。普通70°C PVC在45°C下，二者分别为0.79及0.91，须按条件选择。</w:t>
       </w:r>
     </w:p>
     <w:p>
       <w:r>
-        <w:t>The PPT example specifies three phases, a 20A MCB, 45°C, surface conduit and a 40m route. Its calculation uses 20A load, 380V and 1% upstream drop. These are example conditions, not parameters supplied by Q2.</w:t>
+        <w:t>S81 supplies the factor. A5(1) applies to short-circuit-only and generally overload protection; A5(2) applies when BS 3036 semi-enclosed fuses provide overload protection. At 45°C, ordinary 70°C PVC has factors 0.79 and 0.91 respectively; select by condition.</w:t>
+      </w:r>
+    </w:p>
+    <w:p>
+      <w:pPr>
+        <w:pStyle w:val="Heading2"/>
+      </w:pPr>
+      <w:r>
+        <w:t>（3）Cg：成组 / Grouping</w:t>
+      </w:r>
+    </w:p>
+    <w:p>
+      <w:r>
+        <w:t>S81明确指出成组可显著增加截面。A5(3)按数量及布置取值；例如围护或成束那一行，2回路为0.80，4回路为0.65。数值说明互热影响，不是所有排列都套用这一行。</w:t>
+      </w:r>
+    </w:p>
+    <w:p>
+      <w:r>
+        <w:t>S81 states that grouping may significantly increase size. A5(3) depends on count and arrangement: the enclosed/bunched row gives 0.80 for two circuits and 0.65 for four. Other arrangements require their own row.</w:t>
+      </w:r>
+    </w:p>
+    <w:p>
+      <w:pPr>
+        <w:pStyle w:val="Heading2"/>
+      </w:pPr>
+      <w:r>
+        <w:t>（4）Ci：隔热 / Thermal insulation</w:t>
+      </w:r>
+    </w:p>
+    <w:p>
+      <w:r>
+        <w:t>来自S81及A5(4)。隔热墙或天花内、一侧导热接触的所示条件采用Method 4。单根电缆完全包围超过0.5m且没有更精确资料时，取Method 1开放直接固定额定值的0.5倍；两种条件不能任意叠加。</w:t>
+      </w:r>
+    </w:p>
+    <w:p>
+      <w:r>
+        <w:t>S81 and A5(4) cover insulation. Use Method 4 for the specified wall/ceiling arrangement with one conducting contact surface. For a single cable totally surrounded beyond 0.5m, absent precise data, use 0.5 times Method 1 clipped-direct capacity; do not arbitrarily combine the two conditions.</w:t>
+      </w:r>
+    </w:p>
+    <w:p>
+      <w:pPr>
+        <w:pStyle w:val="Heading2"/>
+      </w:pPr>
+      <w:r>
+        <w:t>（5）Cd：保护器件 / Protective device</w:t>
+      </w:r>
+    </w:p>
+    <w:p>
+      <w:r>
+        <w:t>S81给半封闭熔断器0.725。所给A5(5)明确为BS 3036，其余所列器件1.0。这是器件配合因素，不能把它当作Ca，也不能认为选了A5(2)便自动忽略Cd。</w:t>
+      </w:r>
+    </w:p>
+    <w:p>
+      <w:r>
+        <w:t>S81 gives 0.725 for semi-enclosed fuses; A5(5) specifies BS 3036, with 1.0 for other listed devices. Cd concerns device coordination, differs from Ca, and remains relevant after selecting A5(2).</w:t>
+      </w:r>
+    </w:p>
+    <w:p>
+      <w:pPr>
+        <w:pStyle w:val="Heading1"/>
+        <w:pageBreakBefore/>
+      </w:pPr>
+      <w:r>
+        <w:t>【4】压降、损耗与PPT示例</w:t>
+        <w:br/>
+        <w:t>Voltage drop, loss and the PPT example</w:t>
+      </w:r>
+    </w:p>
+    <w:p>
+      <w:pPr>
+        <w:pStyle w:val="Heading2"/>
+      </w:pPr>
+      <w:r>
+        <w:t>（1）压降与线路长度 / Voltage drop and length</w:t>
+      </w:r>
+    </w:p>
+    <w:p>
+      <w:r>
+        <w:t>S82要求知道电缆类型、截面、安装方式、长度、交流／直流及负载。表列压降以mV/A/m表示；按适用相制及排列选值后，用下式理解电流与长度的影响。上游压降也应计入。</w:t>
+      </w:r>
+    </w:p>
+    <w:p>
+      <w:r>
+        <w:t>S82 requires type, size, installation, length, a.c./d.c. and load. Choose the mV/A/m value for the phase and formation, then use the relation below to understand current and length effects. Include upstream drop.</w:t>
+      </w:r>
+    </w:p>
+    <w:p>
+      <w:pPr>
+        <w:jc w:val="center"/>
+      </w:pPr>
+      <w:r>
+        <w:rPr>
+          <w:b/>
+          <w:sz w:val="24"/>
+        </w:rPr>
+        <w:t>ΔV = v × I</w:t>
+      </w:r>
+      <w:r>
+        <w:rPr>
+          <w:b/>
+          <w:sz w:val="24"/>
+          <w:vertAlign w:val="subscript"/>
+        </w:rPr>
+        <w:t>b</w:t>
+      </w:r>
+      <w:r>
+        <w:rPr>
+          <w:b/>
+          <w:sz w:val="24"/>
+        </w:rPr>
+        <w:t xml:space="preserve"> × L / 1000</w:t>
+      </w:r>
+    </w:p>
+    <w:p>
+      <w:r>
+        <w:t>v为表列压降，Ib以A计，L以m计；结果为V。载流量合格不代表压降合格，这就是正式答案分别列出两者的原因。</w:t>
+      </w:r>
+    </w:p>
+    <w:p>
+      <w:r>
+        <w:t>v is the tabulated value, Ib is in A and L in m, giving V. Passing the capacity check does not ensure acceptable voltage drop, so the written answer addresses both.</w:t>
+      </w:r>
+    </w:p>
+    <w:p>
+      <w:pPr>
+        <w:pStyle w:val="Heading2"/>
+      </w:pPr>
+      <w:r>
+        <w:t>（2）功率损耗及能源效益 / Power loss and efficiency</w:t>
+      </w:r>
+    </w:p>
+    <w:p>
+      <w:r>
+        <w:t>S79列Power loss，S80列Energy efficiency。相同电流下，降低导体电阻可减少损耗，增大截面是降低电阻的方式之一。正式答案只解释该关系，无需额外经济计算。</w:t>
+      </w:r>
+    </w:p>
+    <w:p>
+      <w:r>
+        <w:t>S79 lists power loss and S80 energy efficiency. At the same current, lower conductor resistance reduces loss, and greater cross-section can lower resistance. The answer explains this relation without an additional economic calculation.</w:t>
+      </w:r>
+    </w:p>
+    <w:p>
+      <w:pPr>
+        <w:pStyle w:val="Heading2"/>
+      </w:pPr>
+      <w:r>
+        <w:t>（3）S83示例如何连接三组图表 / How S83 links the extracts</w:t>
+      </w:r>
+    </w:p>
+    <w:p>
+      <w:r>
+        <w:t>仅为说明：PPT例题采用三相、20A MCB、45°C、表面管道、40m线路，计算取负载20A、系统380V及上游压降1%；这些不是Q2另给的设计参数。</w:t>
+      </w:r>
+    </w:p>
+    <w:p>
+      <w:r>
+        <w:t>For illustration only, S83 uses three phases, a 20A MCB, 45°C, surface conduit and 40m, with 20A load, 380V supply and 1% upstream drop. These are example conditions, not additional Q2 design data.</w:t>
       </w:r>
     </w:p>
     <w:tbl>
@@ -936,9 +623,7 @@
               <w:rPr>
                 <w:sz w:val="20"/>
               </w:rPr>
-              <w:t>① 温度修正</w:t>
-              <w:br/>
-              <w:t>Temperature</w:t>
+              <w:t>修正 / Correction</w:t>
             </w:r>
           </w:p>
         </w:tc>
@@ -954,9 +639,9 @@
               <w:rPr>
                 <w:sz w:val="20"/>
               </w:rPr>
-              <w:t>A5(1)中Ca＝0.79，故It ≥ 20/0.79＝25.3A。</w:t>
+              <w:t>A5(1)：Ca＝0.79；It ≥ 20/0.79＝25.3A。</w:t>
               <w:br/>
-              <w:t>Ca = 0.79 from A5(1); required It ≥ 25.3A.</w:t>
+              <w:t>A5(1) gives Ca = 0.79; required It ≥ 25.3A.</w:t>
             </w:r>
           </w:p>
         </w:tc>
@@ -977,9 +662,7 @@
               <w:rPr>
                 <w:sz w:val="20"/>
               </w:rPr>
-              <w:t>② 查载流量</w:t>
-              <w:br/>
-              <w:t>Current rating</w:t>
+              <w:t>选栏位 / Method</w:t>
             </w:r>
           </w:p>
         </w:tc>
@@ -995,9 +678,9 @@
               <w:rPr>
                 <w:sz w:val="20"/>
               </w:rPr>
-              <w:t>表面管道对应Method 3；A6(1)中4mm²三相值28A，满足25.3A需求。</w:t>
+              <w:t>Appendix 7：表面管道对应参考Method 3；A6(1)：4mm²三相值28A。</w:t>
               <w:br/>
-              <w:t>Surface conduit uses Method 3; the 4mm² three-phase rating is 28A, meeting 25.3A.</w:t>
+              <w:t>Surface conduit uses Method 3; A6(1) gives 28A for 4mm² three-phase.</w:t>
             </w:r>
           </w:p>
         </w:tc>
@@ -1018,9 +701,7 @@
               <w:rPr>
                 <w:sz w:val="20"/>
               </w:rPr>
-              <w:t>③ 查压降</w:t>
-              <w:br/>
-              <w:t>Voltage drop</w:t>
+              <w:t>查压降 / Voltage drop</w:t>
             </w:r>
           </w:p>
         </w:tc>
@@ -1036,9 +717,9 @@
               <w:rPr>
                 <w:sz w:val="20"/>
               </w:rPr>
-              <w:t>同一电缆三相压降数据9.5mV/A/m：9.5×20×40/1000＝7.6V，约为380V的2%。</w:t>
+              <w:t>A6(1)：9.5mV/A/m；9.5×20×40/1000＝7.6V，约2%。</w:t>
               <w:br/>
-              <w:t>At 9.5mV/A/m, drop is 7.6V, about 2% of 380V.</w:t>
+              <w:t>At 9.5mV/A/m, drop is 7.6V, approximately 2%.</w:t>
             </w:r>
           </w:p>
         </w:tc>
@@ -1059,9 +740,7 @@
               <w:rPr>
                 <w:sz w:val="20"/>
               </w:rPr>
-              <w:t>④ 合并上游</w:t>
-              <w:br/>
-              <w:t>Include upstream</w:t>
+              <w:t>合并检查 / Combined check</w:t>
             </w:r>
           </w:p>
         </w:tc>
@@ -1077,9 +756,9 @@
               <w:rPr>
                 <w:sz w:val="20"/>
               </w:rPr>
-              <w:t>PPT采用总压降4%；上游1%后余3%，本段约2%，符合例题条件。说明通过载流量后仍需查压降。</w:t>
+              <w:t>PPT例题按总4%、上游1%，余3%；本段约2%，满足例题条件。</w:t>
               <w:br/>
-              <w:t>Under the example’s 4% total allowance, 1% upstream leaves 3%; approximately 2% meets that condition. Capacity and voltage drop are separate checks.</w:t>
+              <w:t>The example allows 4% total less 1% upstream; approximately 2% meets its remaining 3%.</w:t>
             </w:r>
           </w:p>
         </w:tc>
@@ -1087,12 +766,12 @@
     </w:tbl>
     <w:p>
       <w:r>
-        <w:t>正式答案不需要写这组计算：题目要求的是影响因素及定性解释，例题只是说明为什么温度、安装方式、长度及负载都必须考虑。</w:t>
+        <w:t>4%是该课件示例采用的条件，不在定性正文中当作所有工程的统一限值。例题说明查表关系，正式作答无需抄写整组计算。</w:t>
       </w:r>
     </w:p>
     <w:p>
       <w:r>
-        <w:t>The written answer does not need these calculations. They explain why temperature, installation, length and loading matter to the qualitative task.</w:t>
+        <w:t>The 4% is the course example condition, not a universal allowance stated in the answer. The example illustrates table use; its full calculation need not be copied.</w:t>
       </w:r>
     </w:p>
     <w:p>
@@ -1101,9 +780,9 @@
         <w:pageBreakBefore/>
       </w:pPr>
       <w:r>
-        <w:t>6 压降、损耗与最终答题范围</w:t>
+        <w:t>【5】题目所给三份图表是什么</w:t>
         <w:br/>
-        <w:t>Voltage drop, loss and final answer scope</w:t>
+        <w:t>What the three supplied extracts are</w:t>
       </w:r>
     </w:p>
     <w:p>
@@ -1111,54 +790,312 @@
         <w:pStyle w:val="Heading2"/>
       </w:pPr>
       <w:r>
-        <w:t>S82：长度为什么影响选线 / Why length affects selection</w:t>
-      </w:r>
-    </w:p>
-    <w:p>
-      <w:pPr>
-        <w:jc w:val="center"/>
-      </w:pPr>
-      <w:r>
-        <w:rPr>
-          <w:b/>
-          <w:sz w:val="24"/>
-        </w:rPr>
-        <w:t>ΔV = v × I</w:t>
-      </w:r>
-      <w:r>
-        <w:rPr>
-          <w:b/>
-          <w:sz w:val="24"/>
-          <w:vertAlign w:val="subscript"/>
-        </w:rPr>
-        <w:t>b</w:t>
-      </w:r>
-      <w:r>
-        <w:rPr>
-          <w:b/>
-          <w:sz w:val="24"/>
-        </w:rPr>
-        <w:t xml:space="preserve"> × L / 1000</w:t>
+        <w:t>（1）Tables for Cable Correction Factors</w:t>
+        <w:br/>
+        <w:t>电缆修正系数表：Appendix 5</w:t>
       </w:r>
     </w:p>
     <w:p>
       <w:r>
-        <w:t>v为表列压降数据（mV/A/m），Ib为设计电流（A），L为线路长度（m）。在表格适用条件下，电流或长度增大会增加压降。S82要求知道电缆类型、截面、安装方式、长度、交流／直流及负载，因此正文第9项覆盖这些变量。</w:t>
+        <w:t>这份共4页，包括A5(1)至A5(6)，说明现场条件与基准不同时，怎样修正载流量或作保护配合。</w:t>
       </w:r>
     </w:p>
     <w:p>
       <w:r>
-        <w:t>v is the tabulated voltage-drop value in mV/A/m, Ib the design current in A, and L the route length in m. Under the table’s conditions, greater current or length increases drop. S82 requires type, size, installation, length, a.c./d.c. circuit and load; factor 9 covers these inputs.</w:t>
+        <w:t>This four-page extract contains A5(1)–A5(6), explaining derating and protection coordination when actual conditions differ from the base conditions.</w:t>
+      </w:r>
+    </w:p>
+    <w:tbl>
+      <w:tblPr>
+        <w:tblStyle w:val="TableGrid"/>
+        <w:tblW w:type="auto" w:w="0"/>
+        <w:tblLayout w:type="fixed"/>
+        <w:tblLook w:firstColumn="1" w:firstRow="1" w:lastColumn="0" w:lastRow="0" w:noHBand="0" w:noVBand="1" w:val="04A0"/>
+      </w:tblPr>
+      <w:tblGrid>
+        <w:gridCol w:w="2608"/>
+        <w:gridCol w:w="7540"/>
+      </w:tblGrid>
+      <w:tr>
+        <w:trPr>
+          <w:tblHeader/>
+        </w:trPr>
+        <w:tc>
+          <w:tcPr>
+            <w:tcW w:type="dxa" w:w="2608"/>
+            <w:shd w:fill="E8EEF4"/>
+          </w:tcPr>
+          <w:p>
+            <w:r>
+              <w:t>要点 / Point</w:t>
+            </w:r>
+          </w:p>
+        </w:tc>
+        <w:tc>
+          <w:tcPr>
+            <w:tcW w:type="dxa" w:w="7540"/>
+            <w:shd w:fill="E8EEF4"/>
+          </w:tcPr>
+          <w:p>
+            <w:r>
+              <w:t>判读及含义 / Interpretation</w:t>
+            </w:r>
+          </w:p>
+        </w:tc>
+      </w:tr>
+      <w:tr>
+        <w:trPr>
+          <w:cantSplit/>
+        </w:trPr>
+        <w:tc>
+          <w:tcPr>
+            <w:tcW w:type="dxa" w:w="2608"/>
+          </w:tcPr>
+          <w:p>
+            <w:pPr>
+              <w:spacing w:before="40" w:after="80" w:line="250" w:lineRule="auto"/>
+            </w:pPr>
+            <w:r>
+              <w:rPr>
+                <w:sz w:val="20"/>
+              </w:rPr>
+              <w:t>A5(1)</w:t>
+            </w:r>
+          </w:p>
+        </w:tc>
+        <w:tc>
+          <w:tcPr>
+            <w:tcW w:type="dxa" w:w="7540"/>
+          </w:tcPr>
+          <w:p>
+            <w:pPr>
+              <w:spacing w:before="40" w:after="80" w:line="250" w:lineRule="auto"/>
+            </w:pPr>
+            <w:r>
+              <w:rPr>
+                <w:sz w:val="20"/>
+              </w:rPr>
+              <w:t>一般环境温度修正；适用范围须看保护用途。</w:t>
+              <w:br/>
+              <w:t>General ambient-temperature correction, subject to protection duty.</w:t>
+            </w:r>
+          </w:p>
+        </w:tc>
+      </w:tr>
+      <w:tr>
+        <w:trPr>
+          <w:cantSplit/>
+        </w:trPr>
+        <w:tc>
+          <w:tcPr>
+            <w:tcW w:type="dxa" w:w="2608"/>
+          </w:tcPr>
+          <w:p>
+            <w:pPr>
+              <w:spacing w:before="40" w:after="80" w:line="250" w:lineRule="auto"/>
+            </w:pPr>
+            <w:r>
+              <w:rPr>
+                <w:sz w:val="20"/>
+              </w:rPr>
+              <w:t>A5(2)</w:t>
+            </w:r>
+          </w:p>
+        </w:tc>
+        <w:tc>
+          <w:tcPr>
+            <w:tcW w:type="dxa" w:w="7540"/>
+          </w:tcPr>
+          <w:p>
+            <w:pPr>
+              <w:spacing w:before="40" w:after="80" w:line="250" w:lineRule="auto"/>
+            </w:pPr>
+            <w:r>
+              <w:rPr>
+                <w:sz w:val="20"/>
+              </w:rPr>
+              <w:t>BS 3036半封闭熔断器作过载保护时的温度修正。</w:t>
+              <w:br/>
+              <w:t>Temperature correction for overload protection by BS 3036 semi-enclosed fuses.</w:t>
+            </w:r>
+          </w:p>
+        </w:tc>
+      </w:tr>
+      <w:tr>
+        <w:trPr>
+          <w:cantSplit/>
+        </w:trPr>
+        <w:tc>
+          <w:tcPr>
+            <w:tcW w:type="dxa" w:w="2608"/>
+          </w:tcPr>
+          <w:p>
+            <w:pPr>
+              <w:spacing w:before="40" w:after="80" w:line="250" w:lineRule="auto"/>
+            </w:pPr>
+            <w:r>
+              <w:rPr>
+                <w:sz w:val="20"/>
+              </w:rPr>
+              <w:t>A5(3)</w:t>
+            </w:r>
+          </w:p>
+        </w:tc>
+        <w:tc>
+          <w:tcPr>
+            <w:tcW w:type="dxa" w:w="7540"/>
+          </w:tcPr>
+          <w:p>
+            <w:pPr>
+              <w:spacing w:before="40" w:after="80" w:line="250" w:lineRule="auto"/>
+            </w:pPr>
+            <w:r>
+              <w:rPr>
+                <w:sz w:val="20"/>
+              </w:rPr>
+              <w:t>多回路／多根多芯电缆成组修正。</w:t>
+              <w:br/>
+              <w:t>Grouping correction for multiple circuits or multicore cables.</w:t>
+            </w:r>
+          </w:p>
+        </w:tc>
+      </w:tr>
+      <w:tr>
+        <w:trPr>
+          <w:cantSplit/>
+        </w:trPr>
+        <w:tc>
+          <w:tcPr>
+            <w:tcW w:type="dxa" w:w="2608"/>
+          </w:tcPr>
+          <w:p>
+            <w:pPr>
+              <w:spacing w:before="40" w:after="80" w:line="250" w:lineRule="auto"/>
+            </w:pPr>
+            <w:r>
+              <w:rPr>
+                <w:sz w:val="20"/>
+              </w:rPr>
+              <w:t>A5(4)</w:t>
+            </w:r>
+          </w:p>
+        </w:tc>
+        <w:tc>
+          <w:tcPr>
+            <w:tcW w:type="dxa" w:w="7540"/>
+          </w:tcPr>
+          <w:p>
+            <w:pPr>
+              <w:spacing w:before="40" w:after="80" w:line="250" w:lineRule="auto"/>
+            </w:pPr>
+            <w:r>
+              <w:rPr>
+                <w:sz w:val="20"/>
+              </w:rPr>
+              <w:t>电缆被隔热材料包围的修正。</w:t>
+              <w:br/>
+              <w:t>Derating for cables surrounded by thermal insulation.</w:t>
+            </w:r>
+          </w:p>
+        </w:tc>
+      </w:tr>
+      <w:tr>
+        <w:trPr>
+          <w:cantSplit/>
+        </w:trPr>
+        <w:tc>
+          <w:tcPr>
+            <w:tcW w:type="dxa" w:w="2608"/>
+          </w:tcPr>
+          <w:p>
+            <w:pPr>
+              <w:spacing w:before="40" w:after="80" w:line="250" w:lineRule="auto"/>
+            </w:pPr>
+            <w:r>
+              <w:rPr>
+                <w:sz w:val="20"/>
+              </w:rPr>
+              <w:t>A5(5)</w:t>
+            </w:r>
+          </w:p>
+        </w:tc>
+        <w:tc>
+          <w:tcPr>
+            <w:tcW w:type="dxa" w:w="7540"/>
+          </w:tcPr>
+          <w:p>
+            <w:pPr>
+              <w:spacing w:before="40" w:after="80" w:line="250" w:lineRule="auto"/>
+            </w:pPr>
+            <w:r>
+              <w:rPr>
+                <w:sz w:val="20"/>
+              </w:rPr>
+              <w:t>保护器件类型修正：BS 3036为0.725，其他所列器件1.0。</w:t>
+              <w:br/>
+              <w:t>Device-type correction: 0.725 for BS 3036, 1.0 for other listed devices.</w:t>
+            </w:r>
+          </w:p>
+        </w:tc>
+      </w:tr>
+      <w:tr>
+        <w:trPr>
+          <w:cantSplit/>
+        </w:trPr>
+        <w:tc>
+          <w:tcPr>
+            <w:tcW w:type="dxa" w:w="2608"/>
+          </w:tcPr>
+          <w:p>
+            <w:pPr>
+              <w:spacing w:before="40" w:after="80" w:line="250" w:lineRule="auto"/>
+            </w:pPr>
+            <w:r>
+              <w:rPr>
+                <w:sz w:val="20"/>
+              </w:rPr>
+              <w:t>A5(6)</w:t>
+            </w:r>
+          </w:p>
+        </w:tc>
+        <w:tc>
+          <w:tcPr>
+            <w:tcW w:type="dxa" w:w="7540"/>
+          </w:tcPr>
+          <w:p>
+            <w:pPr>
+              <w:spacing w:before="40" w:after="80" w:line="250" w:lineRule="auto"/>
+            </w:pPr>
+            <w:r>
+              <w:rPr>
+                <w:sz w:val="20"/>
+              </w:rPr>
+              <w:t>封闭地沟Methods 18–20的专用修正，用于相应Method 12或13基础值。</w:t>
+              <w:br/>
+              <w:t>Enclosed-trench correction for Methods 18–20, applied to the appropriate Method 12 or 13 base rating.</w:t>
+            </w:r>
+          </w:p>
+        </w:tc>
+      </w:tr>
+    </w:tbl>
+    <w:p>
+      <w:pPr>
+        <w:pStyle w:val="Heading2"/>
+      </w:pPr>
+      <w:r>
+        <w:t>（2）Table A6(1) Cable Standard</w:t>
+        <w:br/>
+        <w:t>电缆规格、载流量及压降表：Appendix 6</w:t>
       </w:r>
     </w:p>
     <w:p>
       <w:r>
-        <w:t>S82采用电源调压6%、设备容许10%，得出配电系统4%；另列实践分配为上升干线1.5%、馈线／最终回路2.5%。S83按已知上游1%分配余下3%。这些是课件中的条件和分配，定性答案无需逐个抄出，也不把它们表述为所有工程的统一数值。</w:t>
+        <w:t>共2页，主要适用于单芯、PVC绝缘、非铠装铜电缆，可带或不带护套；基准环境30°C、导体70°C。第一页按截面、Method、相制及排列列载流量，第二页列压降，提供基准额定数据。</w:t>
       </w:r>
     </w:p>
     <w:p>
       <w:r>
-        <w:t>S82 derives 4% for distribution from 6% source regulation and 10% equipment allowance, and lists a practical split of 1.5% rising mains and 2.5% feeder/final circuit. S83 allocates 3% after its specified 1% upstream drop. These are course conditions and allocations, not universal design values, and need not be reproduced in a qualitative answer.</w:t>
+        <w:t>This two-page extract mainly covers single-core, PVC-insulated, non-armoured copper cable, with or without sheath, at 30°C ambient/70°C conductor temperature. It supplies base current ratings by size, Method, phase and formation, followed by voltage-drop data.</w:t>
       </w:r>
     </w:p>
     <w:p>
@@ -1166,45 +1103,29 @@
         <w:pStyle w:val="Heading2"/>
       </w:pPr>
       <w:r>
-        <w:t>S79–S80：为何保留损耗 / Why retain losses</w:t>
+        <w:t>（3）Appendix 7 Cable Installation Method</w:t>
+        <w:br/>
+        <w:t>电缆安装方式图表</w:t>
       </w:r>
     </w:p>
     <w:p>
       <w:r>
-        <w:t>PPT将功率损耗列为截面标准，将能源效益列为选线因素。因此第10项必须保留。其定性含义是：同一电流下，降低电阻可降低损耗，增大截面是影响电阻的方式之一；不用增加经济计算或课件之外的设计要求。</w:t>
+        <w:t>共5页，以图示把直接固定、管道、线槽、桥架、自由空气及地沟等敷设条件对应参考Method，决定查哪一组额定值。安装方式编号与参考Method并不总相同。</w:t>
       </w:r>
     </w:p>
     <w:p>
       <w:r>
-        <w:t>The PPT names power loss as a sizing criterion and energy efficiency as a selection factor, so factor 10 is retained. Qualitatively, lower resistance reduces loss at the same current, and cross-section affects resistance. No additional economic calculation or design requirement is needed.</w:t>
-      </w:r>
-    </w:p>
-    <w:p>
-      <w:pPr>
-        <w:pStyle w:val="Heading2"/>
-      </w:pPr>
-      <w:r>
-        <w:t>正式答案的组织方式 / Organisation of the written answer</w:t>
+        <w:t>This five-page extract links clipped-direct, conduit, trunking, tray, free-air and trench installations to reference Methods for rating. Installation-item and reference-Method numbers are not always identical.</w:t>
       </w:r>
     </w:p>
     <w:p>
       <w:r>
-        <w:t>前3项解释“选择什么电缆、在什么条件下安装”；第4–8项解释“负载及热条件如何决定所需载流量”；第9–10项补齐“压降和损耗”两项标准。每项都包含因素、影响及选型结果。这样覆盖PPT的全部选线框架，同时保持题目要求的定性层次。</w:t>
+        <w:t>三者配合使用：Appendix 7定安装方式 → A6(1)查基准值 → 按实际条件修正，再检查压降及损耗。</w:t>
       </w:r>
     </w:p>
     <w:p>
       <w:r>
-        <w:t>Factors 1–3 address cable choice and installation; 4–8 explain how demand and thermal conditions determine current-rating needs; 9–10 complete the voltage-drop and power-loss criteria. Each links a factor to its effect and selection consequence, covering the PPT framework at the requested qualitative level.</w:t>
-      </w:r>
-    </w:p>
-    <w:p>
-      <w:r>
-        <w:t>另一份Word仅保留可抄写的中英答案，不含本稿的页码对应、审题提示及例题计算。</w:t>
-      </w:r>
-    </w:p>
-    <w:p>
-      <w:r>
-        <w:t>The companion Word contains only the bilingual written answer, without slide mapping, interpretation notes or worked calculations.</w:t>
+        <w:t>Use Appendix 7 for installation → A6(1) for base data → relevant corrections, then voltage-drop and loss checks.</w:t>
       </w:r>
     </w:p>
     <w:sectPr>
@@ -1238,7 +1159,7 @@
       <w:pStyle w:val="Header"/>
     </w:pPr>
     <w:r>
-      <w:t>PIA5704 | Q2 | 答案分析 / Answer analysis</w:t>
+      <w:t>PIA5704 | Q2 | 答案解析 / Answer analysis</w:t>
     </w:r>
   </w:p>
 </w:hdr>
@@ -1608,7 +1529,7 @@
     <w:qFormat/>
     <w:rsid w:val="00FC693F"/>
     <w:pPr>
-      <w:spacing w:after="100" w:line="254" w:lineRule="auto"/>
+      <w:spacing w:after="80" w:line="247" w:lineRule="auto"/>
     </w:pPr>
     <w:rPr>
       <w:rFonts w:ascii="Calibri" w:hAnsi="Calibri" w:eastAsia="Noto Sans CJK SC"/>
@@ -1694,7 +1615,7 @@
     <w:pPr>
       <w:keepNext/>
       <w:keepLines/>
-      <w:spacing w:before="200" w:after="120"/>
+      <w:spacing w:before="120" w:after="80"/>
       <w:outlineLvl w:val="1"/>
     </w:pPr>
     <w:rPr>

</xml_diff>